<commit_message>
Day 13 filr Added
</commit_message>
<xml_diff>
--- a/Task_Docx/10092912_Day13.docx
+++ b/Task_Docx/10092912_Day13.docx
@@ -19,17 +19,7 @@
           <w:szCs w:val="52"/>
           <w:highlight w:val="cyan"/>
         </w:rPr>
-        <w:t>D</w:t>
-      </w:r>
-      <w:r>
-        <w:rPr>
-          <w:b/>
-          <w:bCs/>
-          <w:sz w:val="52"/>
-          <w:szCs w:val="52"/>
-          <w:highlight w:val="cyan"/>
-        </w:rPr>
-        <w:t>ay 13 - 03rd Aug 2026</w:t>
+        <w:t>Day 13 - 03rd Aug 2026</w:t>
       </w:r>
     </w:p>
     <w:p>
@@ -1552,6 +1542,1225 @@
     </w:p>
     <w:p/>
     <w:p/>
+    <w:p>
+      <w:pPr>
+        <w:rPr>
+          <w:b/>
+          <w:bCs/>
+        </w:rPr>
+      </w:pPr>
+      <w:r>
+        <w:rPr>
+          <w:b/>
+          <w:bCs/>
+        </w:rPr>
+        <w:t>Home Tasks:</w:t>
+      </w:r>
+    </w:p>
+    <w:p>
+      <w:pPr>
+        <w:rPr>
+          <w:b/>
+          <w:bCs/>
+        </w:rPr>
+      </w:pPr>
+    </w:p>
+    <w:p>
+      <w:pPr>
+        <w:rPr>
+          <w:b/>
+          <w:bCs/>
+        </w:rPr>
+      </w:pPr>
+      <w:r>
+        <w:rPr>
+          <w:b/>
+          <w:bCs/>
+        </w:rPr>
+        <w:t>Task 1:</w:t>
+      </w:r>
+    </w:p>
+    <w:p>
+      <w:pPr>
+        <w:rPr>
+          <w:b/>
+          <w:bCs/>
+        </w:rPr>
+      </w:pPr>
+      <w:r>
+        <w:rPr>
+          <w:b/>
+          <w:bCs/>
+        </w:rPr>
+        <w:t xml:space="preserve">What are window functions in </w:t>
+      </w:r>
+      <w:proofErr w:type="spellStart"/>
+      <w:r>
+        <w:rPr>
+          <w:b/>
+          <w:bCs/>
+        </w:rPr>
+        <w:t>Postgresql</w:t>
+      </w:r>
+      <w:proofErr w:type="spellEnd"/>
+      <w:r>
+        <w:rPr>
+          <w:b/>
+          <w:bCs/>
+        </w:rPr>
+        <w:t>?</w:t>
+      </w:r>
+    </w:p>
+    <w:p>
+      <w:r>
+        <w:t>Window functions perform calculations across a set of rows related to the current row without grouping the rows into a single output. Unlike GROUP BY, they return a value for each row while still allowing access to other rows in the result set.</w:t>
+      </w:r>
+    </w:p>
+    <w:p/>
+    <w:p>
+      <w:pPr>
+        <w:rPr>
+          <w:b/>
+          <w:bCs/>
+        </w:rPr>
+      </w:pPr>
+      <w:r>
+        <w:rPr>
+          <w:b/>
+          <w:bCs/>
+        </w:rPr>
+        <w:lastRenderedPageBreak/>
+        <w:t>Task 2:</w:t>
+      </w:r>
+    </w:p>
+    <w:p>
+      <w:pPr>
+        <w:rPr>
+          <w:b/>
+          <w:bCs/>
+        </w:rPr>
+      </w:pPr>
+      <w:r>
+        <w:rPr>
+          <w:b/>
+          <w:bCs/>
+        </w:rPr>
+        <w:t>What are the keywords that we use in window functions? </w:t>
+      </w:r>
+    </w:p>
+    <w:p>
+      <w:r>
+        <w:t>The common keywords used with window functions are:</w:t>
+      </w:r>
+    </w:p>
+    <w:p>
+      <w:pPr>
+        <w:numPr>
+          <w:ilvl w:val="0"/>
+          <w:numId w:val="3"/>
+        </w:numPr>
+      </w:pPr>
+      <w:r>
+        <w:t xml:space="preserve">OVER </w:t>
+      </w:r>
+    </w:p>
+    <w:p>
+      <w:pPr>
+        <w:numPr>
+          <w:ilvl w:val="0"/>
+          <w:numId w:val="3"/>
+        </w:numPr>
+      </w:pPr>
+      <w:r>
+        <w:t xml:space="preserve">PARTITION BY </w:t>
+      </w:r>
+    </w:p>
+    <w:p>
+      <w:pPr>
+        <w:numPr>
+          <w:ilvl w:val="0"/>
+          <w:numId w:val="3"/>
+        </w:numPr>
+      </w:pPr>
+      <w:r>
+        <w:t xml:space="preserve">ORDER BY </w:t>
+      </w:r>
+    </w:p>
+    <w:p>
+      <w:pPr>
+        <w:numPr>
+          <w:ilvl w:val="0"/>
+          <w:numId w:val="3"/>
+        </w:numPr>
+      </w:pPr>
+      <w:r>
+        <w:t xml:space="preserve">ROWS </w:t>
+      </w:r>
+    </w:p>
+    <w:p>
+      <w:pPr>
+        <w:numPr>
+          <w:ilvl w:val="0"/>
+          <w:numId w:val="3"/>
+        </w:numPr>
+      </w:pPr>
+      <w:r>
+        <w:t>RANGE</w:t>
+      </w:r>
+    </w:p>
+    <w:p>
+      <w:pPr>
+        <w:ind w:left="720"/>
+      </w:pPr>
+    </w:p>
+    <w:p>
+      <w:r>
+        <w:t>SELECT</w:t>
+      </w:r>
+    </w:p>
+    <w:p>
+      <w:r>
+        <w:t xml:space="preserve">    Name,</w:t>
+      </w:r>
+    </w:p>
+    <w:p>
+      <w:r>
+        <w:t xml:space="preserve">    Age,</w:t>
+      </w:r>
+    </w:p>
+    <w:p>
+      <w:r>
+        <w:t xml:space="preserve">    </w:t>
+      </w:r>
+      <w:proofErr w:type="gramStart"/>
+      <w:r>
+        <w:t>RANK(</w:t>
+      </w:r>
+      <w:proofErr w:type="gramEnd"/>
+      <w:r>
+        <w:t>) OVER (ORDER BY Age DESC) AS Rank</w:t>
+      </w:r>
+    </w:p>
+    <w:p>
+      <w:r>
+        <w:t>FROM Student;</w:t>
+      </w:r>
+    </w:p>
+    <w:p/>
+    <w:p/>
+    <w:p>
+      <w:pPr>
+        <w:rPr>
+          <w:b/>
+          <w:bCs/>
+        </w:rPr>
+      </w:pPr>
+      <w:r>
+        <w:rPr>
+          <w:b/>
+          <w:bCs/>
+        </w:rPr>
+        <w:t>Task 3:</w:t>
+      </w:r>
+    </w:p>
+    <w:p>
+      <w:pPr>
+        <w:rPr>
+          <w:b/>
+          <w:bCs/>
+        </w:rPr>
+      </w:pPr>
+      <w:r>
+        <w:rPr>
+          <w:b/>
+          <w:bCs/>
+        </w:rPr>
+        <w:t xml:space="preserve">What are the types of window functions in </w:t>
+      </w:r>
+      <w:proofErr w:type="spellStart"/>
+      <w:r>
+        <w:rPr>
+          <w:b/>
+          <w:bCs/>
+        </w:rPr>
+        <w:t>postgres</w:t>
+      </w:r>
+      <w:proofErr w:type="spellEnd"/>
+      <w:r>
+        <w:rPr>
+          <w:b/>
+          <w:bCs/>
+        </w:rPr>
+        <w:t>?</w:t>
+      </w:r>
+    </w:p>
+    <w:p>
+      <w:r>
+        <w:t>Window functions are mainly classified into three categories:</w:t>
+      </w:r>
+    </w:p>
+    <w:p>
+      <w:pPr>
+        <w:rPr>
+          <w:b/>
+          <w:bCs/>
+        </w:rPr>
+      </w:pPr>
+      <w:r>
+        <w:rPr>
+          <w:b/>
+          <w:bCs/>
+        </w:rPr>
+        <w:t>1. Ranking Functions</w:t>
+      </w:r>
+    </w:p>
+    <w:p>
+      <w:pPr>
+        <w:numPr>
+          <w:ilvl w:val="0"/>
+          <w:numId w:val="4"/>
+        </w:numPr>
+      </w:pPr>
+      <w:r>
+        <w:t>ROW_</w:t>
+      </w:r>
+      <w:proofErr w:type="gramStart"/>
+      <w:r>
+        <w:t>NUMBER(</w:t>
+      </w:r>
+      <w:proofErr w:type="gramEnd"/>
+      <w:r>
+        <w:t xml:space="preserve">) </w:t>
+      </w:r>
+    </w:p>
+    <w:p>
+      <w:pPr>
+        <w:numPr>
+          <w:ilvl w:val="0"/>
+          <w:numId w:val="4"/>
+        </w:numPr>
+      </w:pPr>
+      <w:proofErr w:type="gramStart"/>
+      <w:r>
+        <w:t>RANK(</w:t>
+      </w:r>
+      <w:proofErr w:type="gramEnd"/>
+      <w:r>
+        <w:t xml:space="preserve">) </w:t>
+      </w:r>
+    </w:p>
+    <w:p>
+      <w:pPr>
+        <w:numPr>
+          <w:ilvl w:val="0"/>
+          <w:numId w:val="4"/>
+        </w:numPr>
+      </w:pPr>
+      <w:r>
+        <w:t>DENSE_</w:t>
+      </w:r>
+      <w:proofErr w:type="gramStart"/>
+      <w:r>
+        <w:t>RANK(</w:t>
+      </w:r>
+      <w:proofErr w:type="gramEnd"/>
+      <w:r>
+        <w:t xml:space="preserve">) </w:t>
+      </w:r>
+    </w:p>
+    <w:p>
+      <w:pPr>
+        <w:numPr>
+          <w:ilvl w:val="0"/>
+          <w:numId w:val="4"/>
+        </w:numPr>
+      </w:pPr>
+      <w:proofErr w:type="gramStart"/>
+      <w:r>
+        <w:t>NTILE(</w:t>
+      </w:r>
+      <w:proofErr w:type="gramEnd"/>
+      <w:r>
+        <w:t xml:space="preserve">) </w:t>
+      </w:r>
+    </w:p>
+    <w:p>
+      <w:pPr>
+        <w:rPr>
+          <w:b/>
+          <w:bCs/>
+        </w:rPr>
+      </w:pPr>
+      <w:r>
+        <w:rPr>
+          <w:b/>
+          <w:bCs/>
+        </w:rPr>
+        <w:t>2. Aggregate Window Functions</w:t>
+      </w:r>
+    </w:p>
+    <w:p>
+      <w:pPr>
+        <w:numPr>
+          <w:ilvl w:val="0"/>
+          <w:numId w:val="5"/>
+        </w:numPr>
+      </w:pPr>
+      <w:proofErr w:type="gramStart"/>
+      <w:r>
+        <w:t>SUM(</w:t>
+      </w:r>
+      <w:proofErr w:type="gramEnd"/>
+      <w:r>
+        <w:t xml:space="preserve">) </w:t>
+      </w:r>
+    </w:p>
+    <w:p>
+      <w:pPr>
+        <w:numPr>
+          <w:ilvl w:val="0"/>
+          <w:numId w:val="5"/>
+        </w:numPr>
+      </w:pPr>
+      <w:proofErr w:type="gramStart"/>
+      <w:r>
+        <w:t>AVG(</w:t>
+      </w:r>
+      <w:proofErr w:type="gramEnd"/>
+      <w:r>
+        <w:t xml:space="preserve">) </w:t>
+      </w:r>
+    </w:p>
+    <w:p>
+      <w:pPr>
+        <w:numPr>
+          <w:ilvl w:val="0"/>
+          <w:numId w:val="5"/>
+        </w:numPr>
+      </w:pPr>
+      <w:proofErr w:type="gramStart"/>
+      <w:r>
+        <w:t>COUNT(</w:t>
+      </w:r>
+      <w:proofErr w:type="gramEnd"/>
+      <w:r>
+        <w:t xml:space="preserve">) </w:t>
+      </w:r>
+    </w:p>
+    <w:p>
+      <w:pPr>
+        <w:numPr>
+          <w:ilvl w:val="0"/>
+          <w:numId w:val="5"/>
+        </w:numPr>
+      </w:pPr>
+      <w:proofErr w:type="gramStart"/>
+      <w:r>
+        <w:lastRenderedPageBreak/>
+        <w:t>MIN(</w:t>
+      </w:r>
+      <w:proofErr w:type="gramEnd"/>
+      <w:r>
+        <w:t xml:space="preserve">) </w:t>
+      </w:r>
+    </w:p>
+    <w:p>
+      <w:pPr>
+        <w:numPr>
+          <w:ilvl w:val="0"/>
+          <w:numId w:val="5"/>
+        </w:numPr>
+      </w:pPr>
+      <w:proofErr w:type="gramStart"/>
+      <w:r>
+        <w:t>MAX(</w:t>
+      </w:r>
+      <w:proofErr w:type="gramEnd"/>
+      <w:r>
+        <w:t xml:space="preserve">) </w:t>
+      </w:r>
+    </w:p>
+    <w:p>
+      <w:pPr>
+        <w:rPr>
+          <w:b/>
+          <w:bCs/>
+        </w:rPr>
+      </w:pPr>
+      <w:r>
+        <w:rPr>
+          <w:b/>
+          <w:bCs/>
+        </w:rPr>
+        <w:t>3. Value Functions</w:t>
+      </w:r>
+    </w:p>
+    <w:p>
+      <w:pPr>
+        <w:numPr>
+          <w:ilvl w:val="0"/>
+          <w:numId w:val="6"/>
+        </w:numPr>
+      </w:pPr>
+      <w:proofErr w:type="gramStart"/>
+      <w:r>
+        <w:t>LAG(</w:t>
+      </w:r>
+      <w:proofErr w:type="gramEnd"/>
+      <w:r>
+        <w:t xml:space="preserve">) </w:t>
+      </w:r>
+    </w:p>
+    <w:p>
+      <w:pPr>
+        <w:numPr>
+          <w:ilvl w:val="0"/>
+          <w:numId w:val="6"/>
+        </w:numPr>
+      </w:pPr>
+      <w:proofErr w:type="gramStart"/>
+      <w:r>
+        <w:t>LEAD(</w:t>
+      </w:r>
+      <w:proofErr w:type="gramEnd"/>
+      <w:r>
+        <w:t xml:space="preserve">) </w:t>
+      </w:r>
+    </w:p>
+    <w:p>
+      <w:pPr>
+        <w:numPr>
+          <w:ilvl w:val="0"/>
+          <w:numId w:val="6"/>
+        </w:numPr>
+      </w:pPr>
+      <w:r>
+        <w:t>FIRST_</w:t>
+      </w:r>
+      <w:proofErr w:type="gramStart"/>
+      <w:r>
+        <w:t>VALUE(</w:t>
+      </w:r>
+      <w:proofErr w:type="gramEnd"/>
+      <w:r>
+        <w:t xml:space="preserve">) </w:t>
+      </w:r>
+    </w:p>
+    <w:p>
+      <w:pPr>
+        <w:numPr>
+          <w:ilvl w:val="0"/>
+          <w:numId w:val="6"/>
+        </w:numPr>
+      </w:pPr>
+      <w:r>
+        <w:t>LAST_</w:t>
+      </w:r>
+      <w:proofErr w:type="gramStart"/>
+      <w:r>
+        <w:t>VALUE(</w:t>
+      </w:r>
+      <w:proofErr w:type="gramEnd"/>
+      <w:r>
+        <w:t xml:space="preserve">) </w:t>
+      </w:r>
+    </w:p>
+    <w:p>
+      <w:pPr>
+        <w:numPr>
+          <w:ilvl w:val="0"/>
+          <w:numId w:val="6"/>
+        </w:numPr>
+      </w:pPr>
+      <w:r>
+        <w:t>NTH_</w:t>
+      </w:r>
+      <w:proofErr w:type="gramStart"/>
+      <w:r>
+        <w:t>VALUE(</w:t>
+      </w:r>
+      <w:proofErr w:type="gramEnd"/>
+      <w:r>
+        <w:t xml:space="preserve">) </w:t>
+      </w:r>
+    </w:p>
+    <w:p/>
+    <w:p/>
+    <w:p>
+      <w:pPr>
+        <w:rPr>
+          <w:b/>
+          <w:bCs/>
+        </w:rPr>
+      </w:pPr>
+      <w:r>
+        <w:rPr>
+          <w:b/>
+          <w:bCs/>
+        </w:rPr>
+        <w:t>Task 4:</w:t>
+      </w:r>
+    </w:p>
+    <w:p>
+      <w:pPr>
+        <w:rPr>
+          <w:b/>
+          <w:bCs/>
+        </w:rPr>
+      </w:pPr>
+      <w:r>
+        <w:rPr>
+          <w:b/>
+          <w:bCs/>
+        </w:rPr>
+        <w:t>What are the rules while working on window functions?</w:t>
+      </w:r>
+    </w:p>
+    <w:p>
+      <w:r>
+        <w:t xml:space="preserve"> Every window function must use the </w:t>
+      </w:r>
+      <w:proofErr w:type="gramStart"/>
+      <w:r>
+        <w:rPr>
+          <w:b/>
+          <w:bCs/>
+        </w:rPr>
+        <w:t>OVER(</w:t>
+      </w:r>
+      <w:proofErr w:type="gramEnd"/>
+      <w:r>
+        <w:rPr>
+          <w:b/>
+          <w:bCs/>
+        </w:rPr>
+        <w:t>)</w:t>
+      </w:r>
+      <w:r>
+        <w:t xml:space="preserve"> clause. </w:t>
+      </w:r>
+    </w:p>
+    <w:p>
+      <w:r>
+        <w:t xml:space="preserve"> Window functions do </w:t>
+      </w:r>
+      <w:r>
+        <w:rPr>
+          <w:b/>
+          <w:bCs/>
+        </w:rPr>
+        <w:t>not</w:t>
+      </w:r>
+      <w:r>
+        <w:t xml:space="preserve"> reduce the number of rows. </w:t>
+      </w:r>
+    </w:p>
+    <w:p>
+      <w:r>
+        <w:t xml:space="preserve"> They are executed </w:t>
+      </w:r>
+      <w:r>
+        <w:rPr>
+          <w:b/>
+          <w:bCs/>
+        </w:rPr>
+        <w:t>after</w:t>
+      </w:r>
+      <w:r>
+        <w:t xml:space="preserve"> WHERE, GROUP BY, and HAVING. </w:t>
+      </w:r>
+    </w:p>
+    <w:p>
+      <w:r>
+        <w:t xml:space="preserve"> They can use PARTITION BY to divide rows into groups. </w:t>
+      </w:r>
+    </w:p>
+    <w:p>
+      <w:r>
+        <w:t xml:space="preserve"> They can use ORDER BY to define the order of calculation. </w:t>
+      </w:r>
+    </w:p>
+    <w:p>
+      <w:r>
+        <w:t xml:space="preserve"> Window functions cannot be used directly in the WHERE clause.</w:t>
+      </w:r>
+    </w:p>
+    <w:p/>
+    <w:p>
+      <w:pPr>
+        <w:rPr>
+          <w:b/>
+          <w:bCs/>
+        </w:rPr>
+      </w:pPr>
+      <w:r>
+        <w:rPr>
+          <w:b/>
+          <w:bCs/>
+        </w:rPr>
+        <w:t>Task 5:</w:t>
+      </w:r>
+    </w:p>
+    <w:p>
+      <w:pPr>
+        <w:rPr>
+          <w:b/>
+          <w:bCs/>
+        </w:rPr>
+      </w:pPr>
+      <w:r>
+        <w:rPr>
+          <w:b/>
+          <w:bCs/>
+        </w:rPr>
+        <w:t xml:space="preserve">Do we have JSON/JSONB data types in </w:t>
+      </w:r>
+      <w:proofErr w:type="spellStart"/>
+      <w:proofErr w:type="gramStart"/>
+      <w:r>
+        <w:rPr>
+          <w:b/>
+          <w:bCs/>
+        </w:rPr>
+        <w:t>postgresql</w:t>
+      </w:r>
+      <w:proofErr w:type="spellEnd"/>
+      <w:r>
+        <w:rPr>
+          <w:b/>
+          <w:bCs/>
+        </w:rPr>
+        <w:t xml:space="preserve"> ?</w:t>
+      </w:r>
+      <w:proofErr w:type="gramEnd"/>
+      <w:r>
+        <w:rPr>
+          <w:b/>
+          <w:bCs/>
+        </w:rPr>
+        <w:t xml:space="preserve"> What is the diff between them?</w:t>
+      </w:r>
+    </w:p>
+    <w:p>
+      <w:r>
+        <w:t xml:space="preserve">Yes. PostgreSQL supports both </w:t>
+      </w:r>
+      <w:r>
+        <w:rPr>
+          <w:b/>
+          <w:bCs/>
+        </w:rPr>
+        <w:t>JSON</w:t>
+      </w:r>
+      <w:r>
+        <w:t xml:space="preserve"> and </w:t>
+      </w:r>
+      <w:r>
+        <w:rPr>
+          <w:b/>
+          <w:bCs/>
+        </w:rPr>
+        <w:t>JSONB</w:t>
+      </w:r>
+      <w:r>
+        <w:t xml:space="preserve"> data types.</w:t>
+      </w:r>
+    </w:p>
+    <w:p>
+      <w:pPr>
+        <w:rPr>
+          <w:b/>
+          <w:bCs/>
+        </w:rPr>
+      </w:pPr>
+      <w:r>
+        <w:rPr>
+          <w:b/>
+          <w:bCs/>
+        </w:rPr>
+        <w:t>JSON</w:t>
+      </w:r>
+    </w:p>
+    <w:p>
+      <w:pPr>
+        <w:numPr>
+          <w:ilvl w:val="0"/>
+          <w:numId w:val="7"/>
+        </w:numPr>
+      </w:pPr>
+      <w:r>
+        <w:t xml:space="preserve">Stores data as plain text. </w:t>
+      </w:r>
+    </w:p>
+    <w:p>
+      <w:pPr>
+        <w:numPr>
+          <w:ilvl w:val="0"/>
+          <w:numId w:val="7"/>
+        </w:numPr>
+      </w:pPr>
+      <w:r>
+        <w:t xml:space="preserve">Preserves formatting, spaces, and key order. </w:t>
+      </w:r>
+    </w:p>
+    <w:p>
+      <w:pPr>
+        <w:numPr>
+          <w:ilvl w:val="0"/>
+          <w:numId w:val="7"/>
+        </w:numPr>
+      </w:pPr>
+      <w:r>
+        <w:t xml:space="preserve">Slower for searching and querying. </w:t>
+      </w:r>
+    </w:p>
+    <w:p>
+      <w:pPr>
+        <w:rPr>
+          <w:b/>
+          <w:bCs/>
+        </w:rPr>
+      </w:pPr>
+      <w:r>
+        <w:rPr>
+          <w:b/>
+          <w:bCs/>
+        </w:rPr>
+        <w:t>JSONB</w:t>
+      </w:r>
+    </w:p>
+    <w:p>
+      <w:pPr>
+        <w:numPr>
+          <w:ilvl w:val="0"/>
+          <w:numId w:val="8"/>
+        </w:numPr>
+      </w:pPr>
+      <w:r>
+        <w:t xml:space="preserve">Stores data in binary format. </w:t>
+      </w:r>
+    </w:p>
+    <w:p>
+      <w:pPr>
+        <w:numPr>
+          <w:ilvl w:val="0"/>
+          <w:numId w:val="8"/>
+        </w:numPr>
+      </w:pPr>
+      <w:r>
+        <w:lastRenderedPageBreak/>
+        <w:t xml:space="preserve">Removes extra spaces and duplicate keys. </w:t>
+      </w:r>
+    </w:p>
+    <w:p>
+      <w:pPr>
+        <w:numPr>
+          <w:ilvl w:val="0"/>
+          <w:numId w:val="8"/>
+        </w:numPr>
+      </w:pPr>
+      <w:r>
+        <w:t xml:space="preserve">Faster for searching and indexing. </w:t>
+      </w:r>
+    </w:p>
+    <w:p>
+      <w:pPr>
+        <w:numPr>
+          <w:ilvl w:val="0"/>
+          <w:numId w:val="8"/>
+        </w:numPr>
+      </w:pPr>
+      <w:r>
+        <w:t>Supports indexing using GIN indexes.</w:t>
+      </w:r>
+    </w:p>
+    <w:p/>
+    <w:p/>
+    <w:p>
+      <w:pPr>
+        <w:rPr>
+          <w:b/>
+          <w:bCs/>
+        </w:rPr>
+      </w:pPr>
+      <w:r>
+        <w:rPr>
+          <w:b/>
+          <w:bCs/>
+        </w:rPr>
+        <w:t>Task 6:</w:t>
+      </w:r>
+    </w:p>
+    <w:p>
+      <w:pPr>
+        <w:rPr>
+          <w:b/>
+          <w:bCs/>
+        </w:rPr>
+      </w:pPr>
+      <w:r>
+        <w:rPr>
+          <w:b/>
+          <w:bCs/>
+        </w:rPr>
+        <w:t xml:space="preserve">What is full text search in </w:t>
+      </w:r>
+      <w:proofErr w:type="spellStart"/>
+      <w:r>
+        <w:rPr>
+          <w:b/>
+          <w:bCs/>
+        </w:rPr>
+        <w:t>postgresql</w:t>
+      </w:r>
+      <w:proofErr w:type="spellEnd"/>
+      <w:r>
+        <w:rPr>
+          <w:b/>
+          <w:bCs/>
+        </w:rPr>
+        <w:t>? Explain briefly?</w:t>
+      </w:r>
+    </w:p>
+    <w:p>
+      <w:r>
+        <w:rPr>
+          <w:b/>
+          <w:bCs/>
+        </w:rPr>
+        <w:t>Full Text Search (FTS)</w:t>
+      </w:r>
+      <w:r>
+        <w:t xml:space="preserve"> is a PostgreSQL feature that enables efficient searching of words and phrases within large amounts of text.</w:t>
+      </w:r>
+    </w:p>
+    <w:p>
+      <w:r>
+        <w:t>It supports:</w:t>
+      </w:r>
+    </w:p>
+    <w:p>
+      <w:pPr>
+        <w:numPr>
+          <w:ilvl w:val="0"/>
+          <w:numId w:val="9"/>
+        </w:numPr>
+      </w:pPr>
+      <w:r>
+        <w:t xml:space="preserve">Keyword searching </w:t>
+      </w:r>
+    </w:p>
+    <w:p>
+      <w:pPr>
+        <w:numPr>
+          <w:ilvl w:val="0"/>
+          <w:numId w:val="9"/>
+        </w:numPr>
+      </w:pPr>
+      <w:r>
+        <w:t xml:space="preserve">Phrase searching </w:t>
+      </w:r>
+    </w:p>
+    <w:p>
+      <w:pPr>
+        <w:numPr>
+          <w:ilvl w:val="0"/>
+          <w:numId w:val="9"/>
+        </w:numPr>
+      </w:pPr>
+      <w:r>
+        <w:t xml:space="preserve">Ranking search results </w:t>
+      </w:r>
+    </w:p>
+    <w:p>
+      <w:pPr>
+        <w:numPr>
+          <w:ilvl w:val="0"/>
+          <w:numId w:val="9"/>
+        </w:numPr>
+      </w:pPr>
+      <w:r>
+        <w:t>Language-specific dictionaries (stemming and stop words)</w:t>
+      </w:r>
+    </w:p>
+    <w:p/>
+    <w:p>
+      <w:pPr>
+        <w:rPr>
+          <w:b/>
+          <w:bCs/>
+        </w:rPr>
+      </w:pPr>
+      <w:r>
+        <w:rPr>
+          <w:b/>
+          <w:bCs/>
+        </w:rPr>
+        <w:t>Task 7:</w:t>
+      </w:r>
+    </w:p>
+    <w:p>
+      <w:pPr>
+        <w:rPr>
+          <w:b/>
+          <w:bCs/>
+        </w:rPr>
+      </w:pPr>
+      <w:r>
+        <w:rPr>
+          <w:b/>
+          <w:bCs/>
+        </w:rPr>
+        <w:t xml:space="preserve">What do you understand by full text search in </w:t>
+      </w:r>
+      <w:proofErr w:type="spellStart"/>
+      <w:r>
+        <w:rPr>
+          <w:b/>
+          <w:bCs/>
+        </w:rPr>
+        <w:t>postgresql</w:t>
+      </w:r>
+      <w:proofErr w:type="spellEnd"/>
+      <w:r>
+        <w:rPr>
+          <w:b/>
+          <w:bCs/>
+        </w:rPr>
+        <w:t>?</w:t>
+      </w:r>
+    </w:p>
+    <w:p>
+      <w:r>
+        <w:t xml:space="preserve">Full Text Search converts text into searchable tokens using </w:t>
+      </w:r>
+      <w:proofErr w:type="spellStart"/>
+      <w:r>
+        <w:t>to_</w:t>
+      </w:r>
+      <w:proofErr w:type="gramStart"/>
+      <w:r>
+        <w:t>tsvector</w:t>
+      </w:r>
+      <w:proofErr w:type="spellEnd"/>
+      <w:r>
+        <w:t>(</w:t>
+      </w:r>
+      <w:proofErr w:type="gramEnd"/>
+      <w:r>
+        <w:t xml:space="preserve">) and compares them with search terms created using </w:t>
+      </w:r>
+      <w:proofErr w:type="spellStart"/>
+      <w:r>
+        <w:t>to_</w:t>
+      </w:r>
+      <w:proofErr w:type="gramStart"/>
+      <w:r>
+        <w:t>tsquery</w:t>
+      </w:r>
+      <w:proofErr w:type="spellEnd"/>
+      <w:r>
+        <w:t>(</w:t>
+      </w:r>
+      <w:proofErr w:type="gramEnd"/>
+      <w:r>
+        <w:t xml:space="preserve">) or </w:t>
+      </w:r>
+      <w:proofErr w:type="spellStart"/>
+      <w:r>
+        <w:t>plainto_</w:t>
+      </w:r>
+      <w:proofErr w:type="gramStart"/>
+      <w:r>
+        <w:t>tsquery</w:t>
+      </w:r>
+      <w:proofErr w:type="spellEnd"/>
+      <w:r>
+        <w:t>(</w:t>
+      </w:r>
+      <w:proofErr w:type="gramEnd"/>
+      <w:r>
+        <w:t>).</w:t>
+      </w:r>
+    </w:p>
+    <w:p>
+      <w:r>
+        <w:t>Unlike the LIKE operator, Full Text Search:</w:t>
+      </w:r>
+    </w:p>
+    <w:p>
+      <w:pPr>
+        <w:numPr>
+          <w:ilvl w:val="0"/>
+          <w:numId w:val="10"/>
+        </w:numPr>
+      </w:pPr>
+      <w:r>
+        <w:t xml:space="preserve">Is faster for large text data. </w:t>
+      </w:r>
+    </w:p>
+    <w:p>
+      <w:pPr>
+        <w:numPr>
+          <w:ilvl w:val="0"/>
+          <w:numId w:val="10"/>
+        </w:numPr>
+      </w:pPr>
+      <w:r>
+        <w:t xml:space="preserve">Ignores common words (stop words). </w:t>
+      </w:r>
+    </w:p>
+    <w:p>
+      <w:pPr>
+        <w:numPr>
+          <w:ilvl w:val="0"/>
+          <w:numId w:val="10"/>
+        </w:numPr>
+      </w:pPr>
+      <w:r>
+        <w:t xml:space="preserve">Supports stemming (e.g., "running" matches "run"). </w:t>
+      </w:r>
+    </w:p>
+    <w:p>
+      <w:pPr>
+        <w:numPr>
+          <w:ilvl w:val="0"/>
+          <w:numId w:val="10"/>
+        </w:numPr>
+      </w:pPr>
+      <w:r>
+        <w:t>Can rank results based on relevance.</w:t>
+      </w:r>
+    </w:p>
+    <w:p/>
+    <w:p>
+      <w:pPr>
+        <w:rPr>
+          <w:b/>
+          <w:bCs/>
+        </w:rPr>
+      </w:pPr>
+    </w:p>
+    <w:p>
+      <w:pPr>
+        <w:rPr>
+          <w:b/>
+          <w:bCs/>
+        </w:rPr>
+      </w:pPr>
+      <w:r>
+        <w:rPr>
+          <w:b/>
+          <w:bCs/>
+        </w:rPr>
+        <w:t>Task 8:</w:t>
+      </w:r>
+    </w:p>
+    <w:p>
+      <w:pPr>
+        <w:rPr>
+          <w:b/>
+          <w:bCs/>
+        </w:rPr>
+      </w:pPr>
+      <w:r>
+        <w:rPr>
+          <w:b/>
+          <w:bCs/>
+        </w:rPr>
+        <w:t xml:space="preserve">What does </w:t>
+      </w:r>
+      <w:proofErr w:type="spellStart"/>
+      <w:r>
+        <w:rPr>
+          <w:b/>
+          <w:bCs/>
+        </w:rPr>
+        <w:t>savepoint</w:t>
+      </w:r>
+      <w:proofErr w:type="spellEnd"/>
+      <w:r>
+        <w:rPr>
+          <w:b/>
+          <w:bCs/>
+        </w:rPr>
+        <w:t xml:space="preserve"> do in </w:t>
+      </w:r>
+      <w:proofErr w:type="spellStart"/>
+      <w:r>
+        <w:rPr>
+          <w:b/>
+          <w:bCs/>
+        </w:rPr>
+        <w:t>postgres</w:t>
+      </w:r>
+      <w:proofErr w:type="spellEnd"/>
+      <w:r>
+        <w:rPr>
+          <w:b/>
+          <w:bCs/>
+        </w:rPr>
+        <w:t>?</w:t>
+      </w:r>
+    </w:p>
+    <w:p>
+      <w:r>
+        <w:lastRenderedPageBreak/>
+        <w:t>A SAVEPOINT creates a checkpoint within a transaction. It allows you to roll back part of a transaction without rolling back the entire transaction.</w:t>
+      </w:r>
+    </w:p>
+    <w:p/>
+    <w:p>
+      <w:pPr>
+        <w:rPr>
+          <w:b/>
+          <w:bCs/>
+        </w:rPr>
+      </w:pPr>
+      <w:r>
+        <w:rPr>
+          <w:b/>
+          <w:bCs/>
+        </w:rPr>
+        <w:t>Example</w:t>
+      </w:r>
+    </w:p>
+    <w:p>
+      <w:r>
+        <w:t>BEGIN;</w:t>
+      </w:r>
+    </w:p>
+    <w:p/>
+    <w:p>
+      <w:r>
+        <w:t>INSERT INTO Student VALUES (1, 'Vicky', 22);</w:t>
+      </w:r>
+    </w:p>
+    <w:p/>
+    <w:p>
+      <w:r>
+        <w:t>SAVEPOINT sp1;</w:t>
+      </w:r>
+    </w:p>
+    <w:p/>
+    <w:p>
+      <w:r>
+        <w:t>INSERT INTO Student VALUES (2, 'Rahul', 21);</w:t>
+      </w:r>
+    </w:p>
+    <w:p/>
+    <w:p>
+      <w:r>
+        <w:t>ROLLBACK TO SAVEPOINT sp1;</w:t>
+      </w:r>
+    </w:p>
+    <w:p/>
+    <w:p>
+      <w:r>
+        <w:t>COMMIT;</w:t>
+      </w:r>
+    </w:p>
+    <w:p/>
     <w:sectPr>
       <w:pgSz w:w="11906" w:h="16838"/>
       <w:pgMar w:top="1440" w:right="1440" w:bottom="1440" w:left="1440" w:header="708" w:footer="708" w:gutter="0"/>
@@ -1565,6 +2774,900 @@
 <file path=word/numbering.xml><?xml version="1.0" encoding="utf-8"?>
 <w:numbering xmlns:wpc="http://schemas.microsoft.com/office/word/2010/wordprocessingCanvas" xmlns:cx="http://schemas.microsoft.com/office/drawing/2014/chartex" xmlns:cx1="http://schemas.microsoft.com/office/drawing/2015/9/8/chartex" xmlns:cx2="http://schemas.microsoft.com/office/drawing/2015/10/21/chartex" xmlns:cx3="http://schemas.microsoft.com/office/drawing/2016/5/9/chartex" xmlns:cx4="http://schemas.microsoft.com/office/drawing/2016/5/10/chartex" xmlns:cx5="http://schemas.microsoft.com/office/drawing/2016/5/11/chartex" xmlns:cx6="http://schemas.microsoft.com/office/drawing/2016/5/12/chartex" xmlns:cx7="http://schemas.microsoft.com/office/drawing/2016/5/13/chartex" xmlns:cx8="http://schemas.microsoft.com/office/drawing/2016/5/14/chartex" xmlns:mc="http://schemas.openxmlformats.org/markup-compatibility/2006" xmlns:aink="http://schemas.microsoft.com/office/drawing/2016/ink" xmlns:am3d="http://schemas.microsoft.com/office/drawing/2017/model3d" xmlns:o="urn:schemas-microsoft-com:office:office" xmlns:oel="http://schemas.microsoft.com/office/2019/extlst" xmlns:r="http://schemas.openxmlformats.org/officeDocument/2006/relationships" xmlns:m="http://schemas.openxmlformats.org/officeDocument/2006/math" xmlns:v="urn:schemas-microsoft-com:vml" xmlns:wp14="http://schemas.microsoft.com/office/word/2010/wordprocessingDrawing" xmlns:wp="http://schemas.openxmlformats.org/drawingml/2006/wordprocessingDrawing" xmlns:w10="urn:schemas-microsoft-com:office:word" xmlns:w="http://schemas.openxmlformats.org/wordprocessingml/2006/main" xmlns:w14="http://schemas.microsoft.com/office/word/2010/wordml" xmlns:w15="http://schemas.microsoft.com/office/word/2012/wordml" xmlns:w16cex="http://schemas.microsoft.com/office/word/2018/wordml/cex" xmlns:w16cid="http://schemas.microsoft.com/office/word/2016/wordml/cid" xmlns:w16="http://schemas.microsoft.com/office/word/2018/wordml" xmlns:w16du="http://schemas.microsoft.com/office/word/2023/wordml/word16du" xmlns:w16sdtdh="http://schemas.microsoft.com/office/word/2020/wordml/sdtdatahash" xmlns:w16sdtfl="http://schemas.microsoft.com/office/word/2024/wordml/sdtformatlock" xmlns:w16se="http://schemas.microsoft.com/office/word/2015/wordml/symex" xmlns:wpg="http://schemas.microsoft.com/office/word/2010/wordprocessingGroup" xmlns:wpi="http://schemas.microsoft.com/office/word/2010/wordprocessingInk" xmlns:wne="http://schemas.microsoft.com/office/word/2006/wordml" xmlns:wps="http://schemas.microsoft.com/office/word/2010/wordprocessingShape" mc:Ignorable="w14 w15 w16se w16cid w16 w16cex w16sdtdh w16sdtfl w16du wp14">
   <w:abstractNum w:abstractNumId="0" w15:restartNumberingAfterBreak="0">
+    <w:nsid w:val="10425A25"/>
+    <w:multiLevelType w:val="multilevel"/>
+    <w:tmpl w:val="2474EC1C"/>
+    <w:lvl w:ilvl="0">
+      <w:start w:val="1"/>
+      <w:numFmt w:val="bullet"/>
+      <w:lvlText w:val=""/>
+      <w:lvlJc w:val="left"/>
+      <w:pPr>
+        <w:tabs>
+          <w:tab w:val="num" w:pos="720"/>
+        </w:tabs>
+        <w:ind w:left="720" w:hanging="360"/>
+      </w:pPr>
+      <w:rPr>
+        <w:rFonts w:ascii="Symbol" w:hAnsi="Symbol" w:hint="default"/>
+        <w:sz w:val="20"/>
+      </w:rPr>
+    </w:lvl>
+    <w:lvl w:ilvl="1" w:tentative="1">
+      <w:start w:val="1"/>
+      <w:numFmt w:val="bullet"/>
+      <w:lvlText w:val="o"/>
+      <w:lvlJc w:val="left"/>
+      <w:pPr>
+        <w:tabs>
+          <w:tab w:val="num" w:pos="1440"/>
+        </w:tabs>
+        <w:ind w:left="1440" w:hanging="360"/>
+      </w:pPr>
+      <w:rPr>
+        <w:rFonts w:ascii="Courier New" w:hAnsi="Courier New" w:hint="default"/>
+        <w:sz w:val="20"/>
+      </w:rPr>
+    </w:lvl>
+    <w:lvl w:ilvl="2" w:tentative="1">
+      <w:start w:val="1"/>
+      <w:numFmt w:val="bullet"/>
+      <w:lvlText w:val=""/>
+      <w:lvlJc w:val="left"/>
+      <w:pPr>
+        <w:tabs>
+          <w:tab w:val="num" w:pos="2160"/>
+        </w:tabs>
+        <w:ind w:left="2160" w:hanging="360"/>
+      </w:pPr>
+      <w:rPr>
+        <w:rFonts w:ascii="Wingdings" w:hAnsi="Wingdings" w:hint="default"/>
+        <w:sz w:val="20"/>
+      </w:rPr>
+    </w:lvl>
+    <w:lvl w:ilvl="3" w:tentative="1">
+      <w:start w:val="1"/>
+      <w:numFmt w:val="bullet"/>
+      <w:lvlText w:val=""/>
+      <w:lvlJc w:val="left"/>
+      <w:pPr>
+        <w:tabs>
+          <w:tab w:val="num" w:pos="2880"/>
+        </w:tabs>
+        <w:ind w:left="2880" w:hanging="360"/>
+      </w:pPr>
+      <w:rPr>
+        <w:rFonts w:ascii="Wingdings" w:hAnsi="Wingdings" w:hint="default"/>
+        <w:sz w:val="20"/>
+      </w:rPr>
+    </w:lvl>
+    <w:lvl w:ilvl="4" w:tentative="1">
+      <w:start w:val="1"/>
+      <w:numFmt w:val="bullet"/>
+      <w:lvlText w:val=""/>
+      <w:lvlJc w:val="left"/>
+      <w:pPr>
+        <w:tabs>
+          <w:tab w:val="num" w:pos="3600"/>
+        </w:tabs>
+        <w:ind w:left="3600" w:hanging="360"/>
+      </w:pPr>
+      <w:rPr>
+        <w:rFonts w:ascii="Wingdings" w:hAnsi="Wingdings" w:hint="default"/>
+        <w:sz w:val="20"/>
+      </w:rPr>
+    </w:lvl>
+    <w:lvl w:ilvl="5" w:tentative="1">
+      <w:start w:val="1"/>
+      <w:numFmt w:val="bullet"/>
+      <w:lvlText w:val=""/>
+      <w:lvlJc w:val="left"/>
+      <w:pPr>
+        <w:tabs>
+          <w:tab w:val="num" w:pos="4320"/>
+        </w:tabs>
+        <w:ind w:left="4320" w:hanging="360"/>
+      </w:pPr>
+      <w:rPr>
+        <w:rFonts w:ascii="Wingdings" w:hAnsi="Wingdings" w:hint="default"/>
+        <w:sz w:val="20"/>
+      </w:rPr>
+    </w:lvl>
+    <w:lvl w:ilvl="6" w:tentative="1">
+      <w:start w:val="1"/>
+      <w:numFmt w:val="bullet"/>
+      <w:lvlText w:val=""/>
+      <w:lvlJc w:val="left"/>
+      <w:pPr>
+        <w:tabs>
+          <w:tab w:val="num" w:pos="5040"/>
+        </w:tabs>
+        <w:ind w:left="5040" w:hanging="360"/>
+      </w:pPr>
+      <w:rPr>
+        <w:rFonts w:ascii="Wingdings" w:hAnsi="Wingdings" w:hint="default"/>
+        <w:sz w:val="20"/>
+      </w:rPr>
+    </w:lvl>
+    <w:lvl w:ilvl="7" w:tentative="1">
+      <w:start w:val="1"/>
+      <w:numFmt w:val="bullet"/>
+      <w:lvlText w:val=""/>
+      <w:lvlJc w:val="left"/>
+      <w:pPr>
+        <w:tabs>
+          <w:tab w:val="num" w:pos="5760"/>
+        </w:tabs>
+        <w:ind w:left="5760" w:hanging="360"/>
+      </w:pPr>
+      <w:rPr>
+        <w:rFonts w:ascii="Wingdings" w:hAnsi="Wingdings" w:hint="default"/>
+        <w:sz w:val="20"/>
+      </w:rPr>
+    </w:lvl>
+    <w:lvl w:ilvl="8" w:tentative="1">
+      <w:start w:val="1"/>
+      <w:numFmt w:val="bullet"/>
+      <w:lvlText w:val=""/>
+      <w:lvlJc w:val="left"/>
+      <w:pPr>
+        <w:tabs>
+          <w:tab w:val="num" w:pos="6480"/>
+        </w:tabs>
+        <w:ind w:left="6480" w:hanging="360"/>
+      </w:pPr>
+      <w:rPr>
+        <w:rFonts w:ascii="Wingdings" w:hAnsi="Wingdings" w:hint="default"/>
+        <w:sz w:val="20"/>
+      </w:rPr>
+    </w:lvl>
+  </w:abstractNum>
+  <w:abstractNum w:abstractNumId="1" w15:restartNumberingAfterBreak="0">
+    <w:nsid w:val="26EE3929"/>
+    <w:multiLevelType w:val="multilevel"/>
+    <w:tmpl w:val="41B4059C"/>
+    <w:lvl w:ilvl="0">
+      <w:start w:val="1"/>
+      <w:numFmt w:val="bullet"/>
+      <w:lvlText w:val=""/>
+      <w:lvlJc w:val="left"/>
+      <w:pPr>
+        <w:tabs>
+          <w:tab w:val="num" w:pos="720"/>
+        </w:tabs>
+        <w:ind w:left="720" w:hanging="360"/>
+      </w:pPr>
+      <w:rPr>
+        <w:rFonts w:ascii="Symbol" w:hAnsi="Symbol" w:hint="default"/>
+        <w:sz w:val="20"/>
+      </w:rPr>
+    </w:lvl>
+    <w:lvl w:ilvl="1" w:tentative="1">
+      <w:start w:val="1"/>
+      <w:numFmt w:val="bullet"/>
+      <w:lvlText w:val="o"/>
+      <w:lvlJc w:val="left"/>
+      <w:pPr>
+        <w:tabs>
+          <w:tab w:val="num" w:pos="1440"/>
+        </w:tabs>
+        <w:ind w:left="1440" w:hanging="360"/>
+      </w:pPr>
+      <w:rPr>
+        <w:rFonts w:ascii="Courier New" w:hAnsi="Courier New" w:hint="default"/>
+        <w:sz w:val="20"/>
+      </w:rPr>
+    </w:lvl>
+    <w:lvl w:ilvl="2" w:tentative="1">
+      <w:start w:val="1"/>
+      <w:numFmt w:val="bullet"/>
+      <w:lvlText w:val=""/>
+      <w:lvlJc w:val="left"/>
+      <w:pPr>
+        <w:tabs>
+          <w:tab w:val="num" w:pos="2160"/>
+        </w:tabs>
+        <w:ind w:left="2160" w:hanging="360"/>
+      </w:pPr>
+      <w:rPr>
+        <w:rFonts w:ascii="Wingdings" w:hAnsi="Wingdings" w:hint="default"/>
+        <w:sz w:val="20"/>
+      </w:rPr>
+    </w:lvl>
+    <w:lvl w:ilvl="3" w:tentative="1">
+      <w:start w:val="1"/>
+      <w:numFmt w:val="bullet"/>
+      <w:lvlText w:val=""/>
+      <w:lvlJc w:val="left"/>
+      <w:pPr>
+        <w:tabs>
+          <w:tab w:val="num" w:pos="2880"/>
+        </w:tabs>
+        <w:ind w:left="2880" w:hanging="360"/>
+      </w:pPr>
+      <w:rPr>
+        <w:rFonts w:ascii="Wingdings" w:hAnsi="Wingdings" w:hint="default"/>
+        <w:sz w:val="20"/>
+      </w:rPr>
+    </w:lvl>
+    <w:lvl w:ilvl="4" w:tentative="1">
+      <w:start w:val="1"/>
+      <w:numFmt w:val="bullet"/>
+      <w:lvlText w:val=""/>
+      <w:lvlJc w:val="left"/>
+      <w:pPr>
+        <w:tabs>
+          <w:tab w:val="num" w:pos="3600"/>
+        </w:tabs>
+        <w:ind w:left="3600" w:hanging="360"/>
+      </w:pPr>
+      <w:rPr>
+        <w:rFonts w:ascii="Wingdings" w:hAnsi="Wingdings" w:hint="default"/>
+        <w:sz w:val="20"/>
+      </w:rPr>
+    </w:lvl>
+    <w:lvl w:ilvl="5" w:tentative="1">
+      <w:start w:val="1"/>
+      <w:numFmt w:val="bullet"/>
+      <w:lvlText w:val=""/>
+      <w:lvlJc w:val="left"/>
+      <w:pPr>
+        <w:tabs>
+          <w:tab w:val="num" w:pos="4320"/>
+        </w:tabs>
+        <w:ind w:left="4320" w:hanging="360"/>
+      </w:pPr>
+      <w:rPr>
+        <w:rFonts w:ascii="Wingdings" w:hAnsi="Wingdings" w:hint="default"/>
+        <w:sz w:val="20"/>
+      </w:rPr>
+    </w:lvl>
+    <w:lvl w:ilvl="6" w:tentative="1">
+      <w:start w:val="1"/>
+      <w:numFmt w:val="bullet"/>
+      <w:lvlText w:val=""/>
+      <w:lvlJc w:val="left"/>
+      <w:pPr>
+        <w:tabs>
+          <w:tab w:val="num" w:pos="5040"/>
+        </w:tabs>
+        <w:ind w:left="5040" w:hanging="360"/>
+      </w:pPr>
+      <w:rPr>
+        <w:rFonts w:ascii="Wingdings" w:hAnsi="Wingdings" w:hint="default"/>
+        <w:sz w:val="20"/>
+      </w:rPr>
+    </w:lvl>
+    <w:lvl w:ilvl="7" w:tentative="1">
+      <w:start w:val="1"/>
+      <w:numFmt w:val="bullet"/>
+      <w:lvlText w:val=""/>
+      <w:lvlJc w:val="left"/>
+      <w:pPr>
+        <w:tabs>
+          <w:tab w:val="num" w:pos="5760"/>
+        </w:tabs>
+        <w:ind w:left="5760" w:hanging="360"/>
+      </w:pPr>
+      <w:rPr>
+        <w:rFonts w:ascii="Wingdings" w:hAnsi="Wingdings" w:hint="default"/>
+        <w:sz w:val="20"/>
+      </w:rPr>
+    </w:lvl>
+    <w:lvl w:ilvl="8" w:tentative="1">
+      <w:start w:val="1"/>
+      <w:numFmt w:val="bullet"/>
+      <w:lvlText w:val=""/>
+      <w:lvlJc w:val="left"/>
+      <w:pPr>
+        <w:tabs>
+          <w:tab w:val="num" w:pos="6480"/>
+        </w:tabs>
+        <w:ind w:left="6480" w:hanging="360"/>
+      </w:pPr>
+      <w:rPr>
+        <w:rFonts w:ascii="Wingdings" w:hAnsi="Wingdings" w:hint="default"/>
+        <w:sz w:val="20"/>
+      </w:rPr>
+    </w:lvl>
+  </w:abstractNum>
+  <w:abstractNum w:abstractNumId="2" w15:restartNumberingAfterBreak="0">
+    <w:nsid w:val="37975E40"/>
+    <w:multiLevelType w:val="multilevel"/>
+    <w:tmpl w:val="1D6C2346"/>
+    <w:lvl w:ilvl="0">
+      <w:start w:val="1"/>
+      <w:numFmt w:val="bullet"/>
+      <w:lvlText w:val=""/>
+      <w:lvlJc w:val="left"/>
+      <w:pPr>
+        <w:tabs>
+          <w:tab w:val="num" w:pos="720"/>
+        </w:tabs>
+        <w:ind w:left="720" w:hanging="360"/>
+      </w:pPr>
+      <w:rPr>
+        <w:rFonts w:ascii="Symbol" w:hAnsi="Symbol" w:hint="default"/>
+        <w:sz w:val="20"/>
+      </w:rPr>
+    </w:lvl>
+    <w:lvl w:ilvl="1" w:tentative="1">
+      <w:start w:val="1"/>
+      <w:numFmt w:val="bullet"/>
+      <w:lvlText w:val="o"/>
+      <w:lvlJc w:val="left"/>
+      <w:pPr>
+        <w:tabs>
+          <w:tab w:val="num" w:pos="1440"/>
+        </w:tabs>
+        <w:ind w:left="1440" w:hanging="360"/>
+      </w:pPr>
+      <w:rPr>
+        <w:rFonts w:ascii="Courier New" w:hAnsi="Courier New" w:hint="default"/>
+        <w:sz w:val="20"/>
+      </w:rPr>
+    </w:lvl>
+    <w:lvl w:ilvl="2" w:tentative="1">
+      <w:start w:val="1"/>
+      <w:numFmt w:val="bullet"/>
+      <w:lvlText w:val=""/>
+      <w:lvlJc w:val="left"/>
+      <w:pPr>
+        <w:tabs>
+          <w:tab w:val="num" w:pos="2160"/>
+        </w:tabs>
+        <w:ind w:left="2160" w:hanging="360"/>
+      </w:pPr>
+      <w:rPr>
+        <w:rFonts w:ascii="Wingdings" w:hAnsi="Wingdings" w:hint="default"/>
+        <w:sz w:val="20"/>
+      </w:rPr>
+    </w:lvl>
+    <w:lvl w:ilvl="3" w:tentative="1">
+      <w:start w:val="1"/>
+      <w:numFmt w:val="bullet"/>
+      <w:lvlText w:val=""/>
+      <w:lvlJc w:val="left"/>
+      <w:pPr>
+        <w:tabs>
+          <w:tab w:val="num" w:pos="2880"/>
+        </w:tabs>
+        <w:ind w:left="2880" w:hanging="360"/>
+      </w:pPr>
+      <w:rPr>
+        <w:rFonts w:ascii="Wingdings" w:hAnsi="Wingdings" w:hint="default"/>
+        <w:sz w:val="20"/>
+      </w:rPr>
+    </w:lvl>
+    <w:lvl w:ilvl="4" w:tentative="1">
+      <w:start w:val="1"/>
+      <w:numFmt w:val="bullet"/>
+      <w:lvlText w:val=""/>
+      <w:lvlJc w:val="left"/>
+      <w:pPr>
+        <w:tabs>
+          <w:tab w:val="num" w:pos="3600"/>
+        </w:tabs>
+        <w:ind w:left="3600" w:hanging="360"/>
+      </w:pPr>
+      <w:rPr>
+        <w:rFonts w:ascii="Wingdings" w:hAnsi="Wingdings" w:hint="default"/>
+        <w:sz w:val="20"/>
+      </w:rPr>
+    </w:lvl>
+    <w:lvl w:ilvl="5" w:tentative="1">
+      <w:start w:val="1"/>
+      <w:numFmt w:val="bullet"/>
+      <w:lvlText w:val=""/>
+      <w:lvlJc w:val="left"/>
+      <w:pPr>
+        <w:tabs>
+          <w:tab w:val="num" w:pos="4320"/>
+        </w:tabs>
+        <w:ind w:left="4320" w:hanging="360"/>
+      </w:pPr>
+      <w:rPr>
+        <w:rFonts w:ascii="Wingdings" w:hAnsi="Wingdings" w:hint="default"/>
+        <w:sz w:val="20"/>
+      </w:rPr>
+    </w:lvl>
+    <w:lvl w:ilvl="6" w:tentative="1">
+      <w:start w:val="1"/>
+      <w:numFmt w:val="bullet"/>
+      <w:lvlText w:val=""/>
+      <w:lvlJc w:val="left"/>
+      <w:pPr>
+        <w:tabs>
+          <w:tab w:val="num" w:pos="5040"/>
+        </w:tabs>
+        <w:ind w:left="5040" w:hanging="360"/>
+      </w:pPr>
+      <w:rPr>
+        <w:rFonts w:ascii="Wingdings" w:hAnsi="Wingdings" w:hint="default"/>
+        <w:sz w:val="20"/>
+      </w:rPr>
+    </w:lvl>
+    <w:lvl w:ilvl="7" w:tentative="1">
+      <w:start w:val="1"/>
+      <w:numFmt w:val="bullet"/>
+      <w:lvlText w:val=""/>
+      <w:lvlJc w:val="left"/>
+      <w:pPr>
+        <w:tabs>
+          <w:tab w:val="num" w:pos="5760"/>
+        </w:tabs>
+        <w:ind w:left="5760" w:hanging="360"/>
+      </w:pPr>
+      <w:rPr>
+        <w:rFonts w:ascii="Wingdings" w:hAnsi="Wingdings" w:hint="default"/>
+        <w:sz w:val="20"/>
+      </w:rPr>
+    </w:lvl>
+    <w:lvl w:ilvl="8" w:tentative="1">
+      <w:start w:val="1"/>
+      <w:numFmt w:val="bullet"/>
+      <w:lvlText w:val=""/>
+      <w:lvlJc w:val="left"/>
+      <w:pPr>
+        <w:tabs>
+          <w:tab w:val="num" w:pos="6480"/>
+        </w:tabs>
+        <w:ind w:left="6480" w:hanging="360"/>
+      </w:pPr>
+      <w:rPr>
+        <w:rFonts w:ascii="Wingdings" w:hAnsi="Wingdings" w:hint="default"/>
+        <w:sz w:val="20"/>
+      </w:rPr>
+    </w:lvl>
+  </w:abstractNum>
+  <w:abstractNum w:abstractNumId="3" w15:restartNumberingAfterBreak="0">
+    <w:nsid w:val="40EB39AC"/>
+    <w:multiLevelType w:val="multilevel"/>
+    <w:tmpl w:val="5B8434B8"/>
+    <w:lvl w:ilvl="0">
+      <w:start w:val="1"/>
+      <w:numFmt w:val="bullet"/>
+      <w:lvlText w:val=""/>
+      <w:lvlJc w:val="left"/>
+      <w:pPr>
+        <w:tabs>
+          <w:tab w:val="num" w:pos="720"/>
+        </w:tabs>
+        <w:ind w:left="720" w:hanging="360"/>
+      </w:pPr>
+      <w:rPr>
+        <w:rFonts w:ascii="Symbol" w:hAnsi="Symbol" w:hint="default"/>
+        <w:sz w:val="20"/>
+      </w:rPr>
+    </w:lvl>
+    <w:lvl w:ilvl="1" w:tentative="1">
+      <w:start w:val="1"/>
+      <w:numFmt w:val="bullet"/>
+      <w:lvlText w:val="o"/>
+      <w:lvlJc w:val="left"/>
+      <w:pPr>
+        <w:tabs>
+          <w:tab w:val="num" w:pos="1440"/>
+        </w:tabs>
+        <w:ind w:left="1440" w:hanging="360"/>
+      </w:pPr>
+      <w:rPr>
+        <w:rFonts w:ascii="Courier New" w:hAnsi="Courier New" w:hint="default"/>
+        <w:sz w:val="20"/>
+      </w:rPr>
+    </w:lvl>
+    <w:lvl w:ilvl="2" w:tentative="1">
+      <w:start w:val="1"/>
+      <w:numFmt w:val="bullet"/>
+      <w:lvlText w:val=""/>
+      <w:lvlJc w:val="left"/>
+      <w:pPr>
+        <w:tabs>
+          <w:tab w:val="num" w:pos="2160"/>
+        </w:tabs>
+        <w:ind w:left="2160" w:hanging="360"/>
+      </w:pPr>
+      <w:rPr>
+        <w:rFonts w:ascii="Wingdings" w:hAnsi="Wingdings" w:hint="default"/>
+        <w:sz w:val="20"/>
+      </w:rPr>
+    </w:lvl>
+    <w:lvl w:ilvl="3" w:tentative="1">
+      <w:start w:val="1"/>
+      <w:numFmt w:val="bullet"/>
+      <w:lvlText w:val=""/>
+      <w:lvlJc w:val="left"/>
+      <w:pPr>
+        <w:tabs>
+          <w:tab w:val="num" w:pos="2880"/>
+        </w:tabs>
+        <w:ind w:left="2880" w:hanging="360"/>
+      </w:pPr>
+      <w:rPr>
+        <w:rFonts w:ascii="Wingdings" w:hAnsi="Wingdings" w:hint="default"/>
+        <w:sz w:val="20"/>
+      </w:rPr>
+    </w:lvl>
+    <w:lvl w:ilvl="4" w:tentative="1">
+      <w:start w:val="1"/>
+      <w:numFmt w:val="bullet"/>
+      <w:lvlText w:val=""/>
+      <w:lvlJc w:val="left"/>
+      <w:pPr>
+        <w:tabs>
+          <w:tab w:val="num" w:pos="3600"/>
+        </w:tabs>
+        <w:ind w:left="3600" w:hanging="360"/>
+      </w:pPr>
+      <w:rPr>
+        <w:rFonts w:ascii="Wingdings" w:hAnsi="Wingdings" w:hint="default"/>
+        <w:sz w:val="20"/>
+      </w:rPr>
+    </w:lvl>
+    <w:lvl w:ilvl="5" w:tentative="1">
+      <w:start w:val="1"/>
+      <w:numFmt w:val="bullet"/>
+      <w:lvlText w:val=""/>
+      <w:lvlJc w:val="left"/>
+      <w:pPr>
+        <w:tabs>
+          <w:tab w:val="num" w:pos="4320"/>
+        </w:tabs>
+        <w:ind w:left="4320" w:hanging="360"/>
+      </w:pPr>
+      <w:rPr>
+        <w:rFonts w:ascii="Wingdings" w:hAnsi="Wingdings" w:hint="default"/>
+        <w:sz w:val="20"/>
+      </w:rPr>
+    </w:lvl>
+    <w:lvl w:ilvl="6" w:tentative="1">
+      <w:start w:val="1"/>
+      <w:numFmt w:val="bullet"/>
+      <w:lvlText w:val=""/>
+      <w:lvlJc w:val="left"/>
+      <w:pPr>
+        <w:tabs>
+          <w:tab w:val="num" w:pos="5040"/>
+        </w:tabs>
+        <w:ind w:left="5040" w:hanging="360"/>
+      </w:pPr>
+      <w:rPr>
+        <w:rFonts w:ascii="Wingdings" w:hAnsi="Wingdings" w:hint="default"/>
+        <w:sz w:val="20"/>
+      </w:rPr>
+    </w:lvl>
+    <w:lvl w:ilvl="7" w:tentative="1">
+      <w:start w:val="1"/>
+      <w:numFmt w:val="bullet"/>
+      <w:lvlText w:val=""/>
+      <w:lvlJc w:val="left"/>
+      <w:pPr>
+        <w:tabs>
+          <w:tab w:val="num" w:pos="5760"/>
+        </w:tabs>
+        <w:ind w:left="5760" w:hanging="360"/>
+      </w:pPr>
+      <w:rPr>
+        <w:rFonts w:ascii="Wingdings" w:hAnsi="Wingdings" w:hint="default"/>
+        <w:sz w:val="20"/>
+      </w:rPr>
+    </w:lvl>
+    <w:lvl w:ilvl="8" w:tentative="1">
+      <w:start w:val="1"/>
+      <w:numFmt w:val="bullet"/>
+      <w:lvlText w:val=""/>
+      <w:lvlJc w:val="left"/>
+      <w:pPr>
+        <w:tabs>
+          <w:tab w:val="num" w:pos="6480"/>
+        </w:tabs>
+        <w:ind w:left="6480" w:hanging="360"/>
+      </w:pPr>
+      <w:rPr>
+        <w:rFonts w:ascii="Wingdings" w:hAnsi="Wingdings" w:hint="default"/>
+        <w:sz w:val="20"/>
+      </w:rPr>
+    </w:lvl>
+  </w:abstractNum>
+  <w:abstractNum w:abstractNumId="4" w15:restartNumberingAfterBreak="0">
+    <w:nsid w:val="5D8D2988"/>
+    <w:multiLevelType w:val="multilevel"/>
+    <w:tmpl w:val="14985192"/>
+    <w:lvl w:ilvl="0">
+      <w:start w:val="1"/>
+      <w:numFmt w:val="bullet"/>
+      <w:lvlText w:val=""/>
+      <w:lvlJc w:val="left"/>
+      <w:pPr>
+        <w:tabs>
+          <w:tab w:val="num" w:pos="720"/>
+        </w:tabs>
+        <w:ind w:left="720" w:hanging="360"/>
+      </w:pPr>
+      <w:rPr>
+        <w:rFonts w:ascii="Symbol" w:hAnsi="Symbol" w:hint="default"/>
+        <w:sz w:val="20"/>
+      </w:rPr>
+    </w:lvl>
+    <w:lvl w:ilvl="1" w:tentative="1">
+      <w:start w:val="1"/>
+      <w:numFmt w:val="bullet"/>
+      <w:lvlText w:val="o"/>
+      <w:lvlJc w:val="left"/>
+      <w:pPr>
+        <w:tabs>
+          <w:tab w:val="num" w:pos="1440"/>
+        </w:tabs>
+        <w:ind w:left="1440" w:hanging="360"/>
+      </w:pPr>
+      <w:rPr>
+        <w:rFonts w:ascii="Courier New" w:hAnsi="Courier New" w:hint="default"/>
+        <w:sz w:val="20"/>
+      </w:rPr>
+    </w:lvl>
+    <w:lvl w:ilvl="2" w:tentative="1">
+      <w:start w:val="1"/>
+      <w:numFmt w:val="bullet"/>
+      <w:lvlText w:val=""/>
+      <w:lvlJc w:val="left"/>
+      <w:pPr>
+        <w:tabs>
+          <w:tab w:val="num" w:pos="2160"/>
+        </w:tabs>
+        <w:ind w:left="2160" w:hanging="360"/>
+      </w:pPr>
+      <w:rPr>
+        <w:rFonts w:ascii="Wingdings" w:hAnsi="Wingdings" w:hint="default"/>
+        <w:sz w:val="20"/>
+      </w:rPr>
+    </w:lvl>
+    <w:lvl w:ilvl="3" w:tentative="1">
+      <w:start w:val="1"/>
+      <w:numFmt w:val="bullet"/>
+      <w:lvlText w:val=""/>
+      <w:lvlJc w:val="left"/>
+      <w:pPr>
+        <w:tabs>
+          <w:tab w:val="num" w:pos="2880"/>
+        </w:tabs>
+        <w:ind w:left="2880" w:hanging="360"/>
+      </w:pPr>
+      <w:rPr>
+        <w:rFonts w:ascii="Wingdings" w:hAnsi="Wingdings" w:hint="default"/>
+        <w:sz w:val="20"/>
+      </w:rPr>
+    </w:lvl>
+    <w:lvl w:ilvl="4" w:tentative="1">
+      <w:start w:val="1"/>
+      <w:numFmt w:val="bullet"/>
+      <w:lvlText w:val=""/>
+      <w:lvlJc w:val="left"/>
+      <w:pPr>
+        <w:tabs>
+          <w:tab w:val="num" w:pos="3600"/>
+        </w:tabs>
+        <w:ind w:left="3600" w:hanging="360"/>
+      </w:pPr>
+      <w:rPr>
+        <w:rFonts w:ascii="Wingdings" w:hAnsi="Wingdings" w:hint="default"/>
+        <w:sz w:val="20"/>
+      </w:rPr>
+    </w:lvl>
+    <w:lvl w:ilvl="5" w:tentative="1">
+      <w:start w:val="1"/>
+      <w:numFmt w:val="bullet"/>
+      <w:lvlText w:val=""/>
+      <w:lvlJc w:val="left"/>
+      <w:pPr>
+        <w:tabs>
+          <w:tab w:val="num" w:pos="4320"/>
+        </w:tabs>
+        <w:ind w:left="4320" w:hanging="360"/>
+      </w:pPr>
+      <w:rPr>
+        <w:rFonts w:ascii="Wingdings" w:hAnsi="Wingdings" w:hint="default"/>
+        <w:sz w:val="20"/>
+      </w:rPr>
+    </w:lvl>
+    <w:lvl w:ilvl="6" w:tentative="1">
+      <w:start w:val="1"/>
+      <w:numFmt w:val="bullet"/>
+      <w:lvlText w:val=""/>
+      <w:lvlJc w:val="left"/>
+      <w:pPr>
+        <w:tabs>
+          <w:tab w:val="num" w:pos="5040"/>
+        </w:tabs>
+        <w:ind w:left="5040" w:hanging="360"/>
+      </w:pPr>
+      <w:rPr>
+        <w:rFonts w:ascii="Wingdings" w:hAnsi="Wingdings" w:hint="default"/>
+        <w:sz w:val="20"/>
+      </w:rPr>
+    </w:lvl>
+    <w:lvl w:ilvl="7" w:tentative="1">
+      <w:start w:val="1"/>
+      <w:numFmt w:val="bullet"/>
+      <w:lvlText w:val=""/>
+      <w:lvlJc w:val="left"/>
+      <w:pPr>
+        <w:tabs>
+          <w:tab w:val="num" w:pos="5760"/>
+        </w:tabs>
+        <w:ind w:left="5760" w:hanging="360"/>
+      </w:pPr>
+      <w:rPr>
+        <w:rFonts w:ascii="Wingdings" w:hAnsi="Wingdings" w:hint="default"/>
+        <w:sz w:val="20"/>
+      </w:rPr>
+    </w:lvl>
+    <w:lvl w:ilvl="8" w:tentative="1">
+      <w:start w:val="1"/>
+      <w:numFmt w:val="bullet"/>
+      <w:lvlText w:val=""/>
+      <w:lvlJc w:val="left"/>
+      <w:pPr>
+        <w:tabs>
+          <w:tab w:val="num" w:pos="6480"/>
+        </w:tabs>
+        <w:ind w:left="6480" w:hanging="360"/>
+      </w:pPr>
+      <w:rPr>
+        <w:rFonts w:ascii="Wingdings" w:hAnsi="Wingdings" w:hint="default"/>
+        <w:sz w:val="20"/>
+      </w:rPr>
+    </w:lvl>
+  </w:abstractNum>
+  <w:abstractNum w:abstractNumId="5" w15:restartNumberingAfterBreak="0">
+    <w:nsid w:val="63742C1F"/>
+    <w:multiLevelType w:val="multilevel"/>
+    <w:tmpl w:val="BD04E3D4"/>
+    <w:lvl w:ilvl="0">
+      <w:start w:val="1"/>
+      <w:numFmt w:val="bullet"/>
+      <w:lvlText w:val=""/>
+      <w:lvlJc w:val="left"/>
+      <w:pPr>
+        <w:tabs>
+          <w:tab w:val="num" w:pos="720"/>
+        </w:tabs>
+        <w:ind w:left="720" w:hanging="360"/>
+      </w:pPr>
+      <w:rPr>
+        <w:rFonts w:ascii="Symbol" w:hAnsi="Symbol" w:hint="default"/>
+        <w:sz w:val="20"/>
+      </w:rPr>
+    </w:lvl>
+    <w:lvl w:ilvl="1" w:tentative="1">
+      <w:start w:val="1"/>
+      <w:numFmt w:val="bullet"/>
+      <w:lvlText w:val="o"/>
+      <w:lvlJc w:val="left"/>
+      <w:pPr>
+        <w:tabs>
+          <w:tab w:val="num" w:pos="1440"/>
+        </w:tabs>
+        <w:ind w:left="1440" w:hanging="360"/>
+      </w:pPr>
+      <w:rPr>
+        <w:rFonts w:ascii="Courier New" w:hAnsi="Courier New" w:hint="default"/>
+        <w:sz w:val="20"/>
+      </w:rPr>
+    </w:lvl>
+    <w:lvl w:ilvl="2" w:tentative="1">
+      <w:start w:val="1"/>
+      <w:numFmt w:val="bullet"/>
+      <w:lvlText w:val=""/>
+      <w:lvlJc w:val="left"/>
+      <w:pPr>
+        <w:tabs>
+          <w:tab w:val="num" w:pos="2160"/>
+        </w:tabs>
+        <w:ind w:left="2160" w:hanging="360"/>
+      </w:pPr>
+      <w:rPr>
+        <w:rFonts w:ascii="Wingdings" w:hAnsi="Wingdings" w:hint="default"/>
+        <w:sz w:val="20"/>
+      </w:rPr>
+    </w:lvl>
+    <w:lvl w:ilvl="3" w:tentative="1">
+      <w:start w:val="1"/>
+      <w:numFmt w:val="bullet"/>
+      <w:lvlText w:val=""/>
+      <w:lvlJc w:val="left"/>
+      <w:pPr>
+        <w:tabs>
+          <w:tab w:val="num" w:pos="2880"/>
+        </w:tabs>
+        <w:ind w:left="2880" w:hanging="360"/>
+      </w:pPr>
+      <w:rPr>
+        <w:rFonts w:ascii="Wingdings" w:hAnsi="Wingdings" w:hint="default"/>
+        <w:sz w:val="20"/>
+      </w:rPr>
+    </w:lvl>
+    <w:lvl w:ilvl="4" w:tentative="1">
+      <w:start w:val="1"/>
+      <w:numFmt w:val="bullet"/>
+      <w:lvlText w:val=""/>
+      <w:lvlJc w:val="left"/>
+      <w:pPr>
+        <w:tabs>
+          <w:tab w:val="num" w:pos="3600"/>
+        </w:tabs>
+        <w:ind w:left="3600" w:hanging="360"/>
+      </w:pPr>
+      <w:rPr>
+        <w:rFonts w:ascii="Wingdings" w:hAnsi="Wingdings" w:hint="default"/>
+        <w:sz w:val="20"/>
+      </w:rPr>
+    </w:lvl>
+    <w:lvl w:ilvl="5" w:tentative="1">
+      <w:start w:val="1"/>
+      <w:numFmt w:val="bullet"/>
+      <w:lvlText w:val=""/>
+      <w:lvlJc w:val="left"/>
+      <w:pPr>
+        <w:tabs>
+          <w:tab w:val="num" w:pos="4320"/>
+        </w:tabs>
+        <w:ind w:left="4320" w:hanging="360"/>
+      </w:pPr>
+      <w:rPr>
+        <w:rFonts w:ascii="Wingdings" w:hAnsi="Wingdings" w:hint="default"/>
+        <w:sz w:val="20"/>
+      </w:rPr>
+    </w:lvl>
+    <w:lvl w:ilvl="6" w:tentative="1">
+      <w:start w:val="1"/>
+      <w:numFmt w:val="bullet"/>
+      <w:lvlText w:val=""/>
+      <w:lvlJc w:val="left"/>
+      <w:pPr>
+        <w:tabs>
+          <w:tab w:val="num" w:pos="5040"/>
+        </w:tabs>
+        <w:ind w:left="5040" w:hanging="360"/>
+      </w:pPr>
+      <w:rPr>
+        <w:rFonts w:ascii="Wingdings" w:hAnsi="Wingdings" w:hint="default"/>
+        <w:sz w:val="20"/>
+      </w:rPr>
+    </w:lvl>
+    <w:lvl w:ilvl="7" w:tentative="1">
+      <w:start w:val="1"/>
+      <w:numFmt w:val="bullet"/>
+      <w:lvlText w:val=""/>
+      <w:lvlJc w:val="left"/>
+      <w:pPr>
+        <w:tabs>
+          <w:tab w:val="num" w:pos="5760"/>
+        </w:tabs>
+        <w:ind w:left="5760" w:hanging="360"/>
+      </w:pPr>
+      <w:rPr>
+        <w:rFonts w:ascii="Wingdings" w:hAnsi="Wingdings" w:hint="default"/>
+        <w:sz w:val="20"/>
+      </w:rPr>
+    </w:lvl>
+    <w:lvl w:ilvl="8" w:tentative="1">
+      <w:start w:val="1"/>
+      <w:numFmt w:val="bullet"/>
+      <w:lvlText w:val=""/>
+      <w:lvlJc w:val="left"/>
+      <w:pPr>
+        <w:tabs>
+          <w:tab w:val="num" w:pos="6480"/>
+        </w:tabs>
+        <w:ind w:left="6480" w:hanging="360"/>
+      </w:pPr>
+      <w:rPr>
+        <w:rFonts w:ascii="Wingdings" w:hAnsi="Wingdings" w:hint="default"/>
+        <w:sz w:val="20"/>
+      </w:rPr>
+    </w:lvl>
+  </w:abstractNum>
+  <w:abstractNum w:abstractNumId="6" w15:restartNumberingAfterBreak="0">
     <w:nsid w:val="68100971"/>
     <w:multiLevelType w:val="multilevel"/>
     <w:tmpl w:val="D67624D2"/>
@@ -1713,7 +3816,156 @@
       </w:rPr>
     </w:lvl>
   </w:abstractNum>
-  <w:abstractNum w:abstractNumId="1" w15:restartNumberingAfterBreak="0">
+  <w:abstractNum w:abstractNumId="7" w15:restartNumberingAfterBreak="0">
+    <w:nsid w:val="6CF13725"/>
+    <w:multiLevelType w:val="multilevel"/>
+    <w:tmpl w:val="AE6267D2"/>
+    <w:lvl w:ilvl="0">
+      <w:start w:val="1"/>
+      <w:numFmt w:val="bullet"/>
+      <w:lvlText w:val=""/>
+      <w:lvlJc w:val="left"/>
+      <w:pPr>
+        <w:tabs>
+          <w:tab w:val="num" w:pos="720"/>
+        </w:tabs>
+        <w:ind w:left="720" w:hanging="360"/>
+      </w:pPr>
+      <w:rPr>
+        <w:rFonts w:ascii="Symbol" w:hAnsi="Symbol" w:hint="default"/>
+        <w:sz w:val="20"/>
+      </w:rPr>
+    </w:lvl>
+    <w:lvl w:ilvl="1" w:tentative="1">
+      <w:start w:val="1"/>
+      <w:numFmt w:val="bullet"/>
+      <w:lvlText w:val="o"/>
+      <w:lvlJc w:val="left"/>
+      <w:pPr>
+        <w:tabs>
+          <w:tab w:val="num" w:pos="1440"/>
+        </w:tabs>
+        <w:ind w:left="1440" w:hanging="360"/>
+      </w:pPr>
+      <w:rPr>
+        <w:rFonts w:ascii="Courier New" w:hAnsi="Courier New" w:hint="default"/>
+        <w:sz w:val="20"/>
+      </w:rPr>
+    </w:lvl>
+    <w:lvl w:ilvl="2" w:tentative="1">
+      <w:start w:val="1"/>
+      <w:numFmt w:val="bullet"/>
+      <w:lvlText w:val=""/>
+      <w:lvlJc w:val="left"/>
+      <w:pPr>
+        <w:tabs>
+          <w:tab w:val="num" w:pos="2160"/>
+        </w:tabs>
+        <w:ind w:left="2160" w:hanging="360"/>
+      </w:pPr>
+      <w:rPr>
+        <w:rFonts w:ascii="Wingdings" w:hAnsi="Wingdings" w:hint="default"/>
+        <w:sz w:val="20"/>
+      </w:rPr>
+    </w:lvl>
+    <w:lvl w:ilvl="3" w:tentative="1">
+      <w:start w:val="1"/>
+      <w:numFmt w:val="bullet"/>
+      <w:lvlText w:val=""/>
+      <w:lvlJc w:val="left"/>
+      <w:pPr>
+        <w:tabs>
+          <w:tab w:val="num" w:pos="2880"/>
+        </w:tabs>
+        <w:ind w:left="2880" w:hanging="360"/>
+      </w:pPr>
+      <w:rPr>
+        <w:rFonts w:ascii="Wingdings" w:hAnsi="Wingdings" w:hint="default"/>
+        <w:sz w:val="20"/>
+      </w:rPr>
+    </w:lvl>
+    <w:lvl w:ilvl="4" w:tentative="1">
+      <w:start w:val="1"/>
+      <w:numFmt w:val="bullet"/>
+      <w:lvlText w:val=""/>
+      <w:lvlJc w:val="left"/>
+      <w:pPr>
+        <w:tabs>
+          <w:tab w:val="num" w:pos="3600"/>
+        </w:tabs>
+        <w:ind w:left="3600" w:hanging="360"/>
+      </w:pPr>
+      <w:rPr>
+        <w:rFonts w:ascii="Wingdings" w:hAnsi="Wingdings" w:hint="default"/>
+        <w:sz w:val="20"/>
+      </w:rPr>
+    </w:lvl>
+    <w:lvl w:ilvl="5" w:tentative="1">
+      <w:start w:val="1"/>
+      <w:numFmt w:val="bullet"/>
+      <w:lvlText w:val=""/>
+      <w:lvlJc w:val="left"/>
+      <w:pPr>
+        <w:tabs>
+          <w:tab w:val="num" w:pos="4320"/>
+        </w:tabs>
+        <w:ind w:left="4320" w:hanging="360"/>
+      </w:pPr>
+      <w:rPr>
+        <w:rFonts w:ascii="Wingdings" w:hAnsi="Wingdings" w:hint="default"/>
+        <w:sz w:val="20"/>
+      </w:rPr>
+    </w:lvl>
+    <w:lvl w:ilvl="6" w:tentative="1">
+      <w:start w:val="1"/>
+      <w:numFmt w:val="bullet"/>
+      <w:lvlText w:val=""/>
+      <w:lvlJc w:val="left"/>
+      <w:pPr>
+        <w:tabs>
+          <w:tab w:val="num" w:pos="5040"/>
+        </w:tabs>
+        <w:ind w:left="5040" w:hanging="360"/>
+      </w:pPr>
+      <w:rPr>
+        <w:rFonts w:ascii="Wingdings" w:hAnsi="Wingdings" w:hint="default"/>
+        <w:sz w:val="20"/>
+      </w:rPr>
+    </w:lvl>
+    <w:lvl w:ilvl="7" w:tentative="1">
+      <w:start w:val="1"/>
+      <w:numFmt w:val="bullet"/>
+      <w:lvlText w:val=""/>
+      <w:lvlJc w:val="left"/>
+      <w:pPr>
+        <w:tabs>
+          <w:tab w:val="num" w:pos="5760"/>
+        </w:tabs>
+        <w:ind w:left="5760" w:hanging="360"/>
+      </w:pPr>
+      <w:rPr>
+        <w:rFonts w:ascii="Wingdings" w:hAnsi="Wingdings" w:hint="default"/>
+        <w:sz w:val="20"/>
+      </w:rPr>
+    </w:lvl>
+    <w:lvl w:ilvl="8" w:tentative="1">
+      <w:start w:val="1"/>
+      <w:numFmt w:val="bullet"/>
+      <w:lvlText w:val=""/>
+      <w:lvlJc w:val="left"/>
+      <w:pPr>
+        <w:tabs>
+          <w:tab w:val="num" w:pos="6480"/>
+        </w:tabs>
+        <w:ind w:left="6480" w:hanging="360"/>
+      </w:pPr>
+      <w:rPr>
+        <w:rFonts w:ascii="Wingdings" w:hAnsi="Wingdings" w:hint="default"/>
+        <w:sz w:val="20"/>
+      </w:rPr>
+    </w:lvl>
+  </w:abstractNum>
+  <w:abstractNum w:abstractNumId="8" w15:restartNumberingAfterBreak="0">
     <w:nsid w:val="6F515855"/>
     <w:multiLevelType w:val="multilevel"/>
     <w:tmpl w:val="E37CD2FC"/>
@@ -1862,11 +4114,184 @@
       </w:rPr>
     </w:lvl>
   </w:abstractNum>
+  <w:abstractNum w:abstractNumId="9" w15:restartNumberingAfterBreak="0">
+    <w:nsid w:val="7C67618B"/>
+    <w:multiLevelType w:val="multilevel"/>
+    <w:tmpl w:val="9646716C"/>
+    <w:lvl w:ilvl="0">
+      <w:start w:val="1"/>
+      <w:numFmt w:val="bullet"/>
+      <w:lvlText w:val=""/>
+      <w:lvlJc w:val="left"/>
+      <w:pPr>
+        <w:tabs>
+          <w:tab w:val="num" w:pos="720"/>
+        </w:tabs>
+        <w:ind w:left="720" w:hanging="360"/>
+      </w:pPr>
+      <w:rPr>
+        <w:rFonts w:ascii="Symbol" w:hAnsi="Symbol" w:hint="default"/>
+        <w:sz w:val="20"/>
+      </w:rPr>
+    </w:lvl>
+    <w:lvl w:ilvl="1" w:tentative="1">
+      <w:start w:val="1"/>
+      <w:numFmt w:val="bullet"/>
+      <w:lvlText w:val="o"/>
+      <w:lvlJc w:val="left"/>
+      <w:pPr>
+        <w:tabs>
+          <w:tab w:val="num" w:pos="1440"/>
+        </w:tabs>
+        <w:ind w:left="1440" w:hanging="360"/>
+      </w:pPr>
+      <w:rPr>
+        <w:rFonts w:ascii="Courier New" w:hAnsi="Courier New" w:hint="default"/>
+        <w:sz w:val="20"/>
+      </w:rPr>
+    </w:lvl>
+    <w:lvl w:ilvl="2" w:tentative="1">
+      <w:start w:val="1"/>
+      <w:numFmt w:val="bullet"/>
+      <w:lvlText w:val=""/>
+      <w:lvlJc w:val="left"/>
+      <w:pPr>
+        <w:tabs>
+          <w:tab w:val="num" w:pos="2160"/>
+        </w:tabs>
+        <w:ind w:left="2160" w:hanging="360"/>
+      </w:pPr>
+      <w:rPr>
+        <w:rFonts w:ascii="Wingdings" w:hAnsi="Wingdings" w:hint="default"/>
+        <w:sz w:val="20"/>
+      </w:rPr>
+    </w:lvl>
+    <w:lvl w:ilvl="3" w:tentative="1">
+      <w:start w:val="1"/>
+      <w:numFmt w:val="bullet"/>
+      <w:lvlText w:val=""/>
+      <w:lvlJc w:val="left"/>
+      <w:pPr>
+        <w:tabs>
+          <w:tab w:val="num" w:pos="2880"/>
+        </w:tabs>
+        <w:ind w:left="2880" w:hanging="360"/>
+      </w:pPr>
+      <w:rPr>
+        <w:rFonts w:ascii="Wingdings" w:hAnsi="Wingdings" w:hint="default"/>
+        <w:sz w:val="20"/>
+      </w:rPr>
+    </w:lvl>
+    <w:lvl w:ilvl="4" w:tentative="1">
+      <w:start w:val="1"/>
+      <w:numFmt w:val="bullet"/>
+      <w:lvlText w:val=""/>
+      <w:lvlJc w:val="left"/>
+      <w:pPr>
+        <w:tabs>
+          <w:tab w:val="num" w:pos="3600"/>
+        </w:tabs>
+        <w:ind w:left="3600" w:hanging="360"/>
+      </w:pPr>
+      <w:rPr>
+        <w:rFonts w:ascii="Wingdings" w:hAnsi="Wingdings" w:hint="default"/>
+        <w:sz w:val="20"/>
+      </w:rPr>
+    </w:lvl>
+    <w:lvl w:ilvl="5" w:tentative="1">
+      <w:start w:val="1"/>
+      <w:numFmt w:val="bullet"/>
+      <w:lvlText w:val=""/>
+      <w:lvlJc w:val="left"/>
+      <w:pPr>
+        <w:tabs>
+          <w:tab w:val="num" w:pos="4320"/>
+        </w:tabs>
+        <w:ind w:left="4320" w:hanging="360"/>
+      </w:pPr>
+      <w:rPr>
+        <w:rFonts w:ascii="Wingdings" w:hAnsi="Wingdings" w:hint="default"/>
+        <w:sz w:val="20"/>
+      </w:rPr>
+    </w:lvl>
+    <w:lvl w:ilvl="6" w:tentative="1">
+      <w:start w:val="1"/>
+      <w:numFmt w:val="bullet"/>
+      <w:lvlText w:val=""/>
+      <w:lvlJc w:val="left"/>
+      <w:pPr>
+        <w:tabs>
+          <w:tab w:val="num" w:pos="5040"/>
+        </w:tabs>
+        <w:ind w:left="5040" w:hanging="360"/>
+      </w:pPr>
+      <w:rPr>
+        <w:rFonts w:ascii="Wingdings" w:hAnsi="Wingdings" w:hint="default"/>
+        <w:sz w:val="20"/>
+      </w:rPr>
+    </w:lvl>
+    <w:lvl w:ilvl="7" w:tentative="1">
+      <w:start w:val="1"/>
+      <w:numFmt w:val="bullet"/>
+      <w:lvlText w:val=""/>
+      <w:lvlJc w:val="left"/>
+      <w:pPr>
+        <w:tabs>
+          <w:tab w:val="num" w:pos="5760"/>
+        </w:tabs>
+        <w:ind w:left="5760" w:hanging="360"/>
+      </w:pPr>
+      <w:rPr>
+        <w:rFonts w:ascii="Wingdings" w:hAnsi="Wingdings" w:hint="default"/>
+        <w:sz w:val="20"/>
+      </w:rPr>
+    </w:lvl>
+    <w:lvl w:ilvl="8" w:tentative="1">
+      <w:start w:val="1"/>
+      <w:numFmt w:val="bullet"/>
+      <w:lvlText w:val=""/>
+      <w:lvlJc w:val="left"/>
+      <w:pPr>
+        <w:tabs>
+          <w:tab w:val="num" w:pos="6480"/>
+        </w:tabs>
+        <w:ind w:left="6480" w:hanging="360"/>
+      </w:pPr>
+      <w:rPr>
+        <w:rFonts w:ascii="Wingdings" w:hAnsi="Wingdings" w:hint="default"/>
+        <w:sz w:val="20"/>
+      </w:rPr>
+    </w:lvl>
+  </w:abstractNum>
   <w:num w:numId="1" w16cid:durableId="1622304832">
+    <w:abstractNumId w:val="8"/>
+  </w:num>
+  <w:num w:numId="2" w16cid:durableId="78139198">
+    <w:abstractNumId w:val="6"/>
+  </w:num>
+  <w:num w:numId="3" w16cid:durableId="1156339098">
+    <w:abstractNumId w:val="2"/>
+  </w:num>
+  <w:num w:numId="4" w16cid:durableId="1891111035">
+    <w:abstractNumId w:val="4"/>
+  </w:num>
+  <w:num w:numId="5" w16cid:durableId="626740251">
+    <w:abstractNumId w:val="7"/>
+  </w:num>
+  <w:num w:numId="6" w16cid:durableId="1656564980">
+    <w:abstractNumId w:val="5"/>
+  </w:num>
+  <w:num w:numId="7" w16cid:durableId="1327637513">
+    <w:abstractNumId w:val="0"/>
+  </w:num>
+  <w:num w:numId="8" w16cid:durableId="1524051885">
     <w:abstractNumId w:val="1"/>
   </w:num>
-  <w:num w:numId="2" w16cid:durableId="78139198">
-    <w:abstractNumId w:val="0"/>
+  <w:num w:numId="9" w16cid:durableId="2128619718">
+    <w:abstractNumId w:val="3"/>
+  </w:num>
+  <w:num w:numId="10" w16cid:durableId="1542285077">
+    <w:abstractNumId w:val="9"/>
   </w:num>
 </w:numbering>
 </file>

</xml_diff>

<commit_message>
Day 13 file Added
</commit_message>
<xml_diff>
--- a/Task_Docx/10092912_Day13.docx
+++ b/Task_Docx/10092912_Day13.docx
@@ -66,33 +66,8 @@
           <w:b/>
           <w:bCs/>
         </w:rPr>
-        <w:t xml:space="preserve">What is an ER diagram? Draw an entity </w:t>
-      </w:r>
-      <w:proofErr w:type="gramStart"/>
-      <w:r>
-        <w:rPr>
-          <w:b/>
-          <w:bCs/>
-        </w:rPr>
-        <w:t>relationship  diagram</w:t>
-      </w:r>
-      <w:proofErr w:type="gramEnd"/>
-      <w:r>
-        <w:rPr>
-          <w:b/>
-          <w:bCs/>
-        </w:rPr>
-        <w:t xml:space="preserve"> with </w:t>
-      </w:r>
-      <w:proofErr w:type="gramStart"/>
-      <w:r>
-        <w:rPr>
-          <w:b/>
-          <w:bCs/>
-        </w:rPr>
-        <w:t>datatypes .</w:t>
-      </w:r>
-      <w:proofErr w:type="gramEnd"/>
+        <w:t>What is an ER diagram? Draw an entity relationship  diagram with datatypes .</w:t>
+      </w:r>
     </w:p>
     <w:p>
       <w:r>
@@ -294,33 +269,8 @@
           <w:b/>
           <w:bCs/>
         </w:rPr>
-        <w:t xml:space="preserve">Do you think Indexing strategy improve the </w:t>
-      </w:r>
-      <w:proofErr w:type="gramStart"/>
-      <w:r>
-        <w:rPr>
-          <w:b/>
-          <w:bCs/>
-        </w:rPr>
-        <w:t>query  performance</w:t>
-      </w:r>
-      <w:proofErr w:type="gramEnd"/>
-      <w:r>
-        <w:rPr>
-          <w:b/>
-          <w:bCs/>
-        </w:rPr>
-        <w:t xml:space="preserve"> ? </w:t>
-      </w:r>
-      <w:proofErr w:type="gramStart"/>
-      <w:r>
-        <w:rPr>
-          <w:b/>
-          <w:bCs/>
-        </w:rPr>
-        <w:t>explain .</w:t>
-      </w:r>
-      <w:proofErr w:type="gramEnd"/>
+        <w:t>Do you think Indexing strategy improve the query  performance ? explain .</w:t>
+      </w:r>
     </w:p>
     <w:p>
       <w:r>
@@ -398,14 +348,7 @@
       </w:r>
       <w:r>
         <w:br/>
-      </w:r>
-      <w:proofErr w:type="spellStart"/>
-      <w:r>
-        <w:t>Atomicity</w:t>
-      </w:r>
-      <w:proofErr w:type="spellEnd"/>
-      <w:r>
-        <w:t xml:space="preserve"> means </w:t>
+        <w:t xml:space="preserve">Atomicity means </w:t>
       </w:r>
       <w:r>
         <w:rPr>
@@ -470,14 +413,7 @@
       </w:r>
       <w:r>
         <w:br/>
-      </w:r>
-      <w:proofErr w:type="spellStart"/>
-      <w:r>
-        <w:t>Consistency</w:t>
-      </w:r>
-      <w:proofErr w:type="spellEnd"/>
-      <w:r>
-        <w:t xml:space="preserve"> ensures that a transaction takes the database from </w:t>
+        <w:t xml:space="preserve">Consistency ensures that a transaction takes the database from </w:t>
       </w:r>
       <w:r>
         <w:rPr>
@@ -525,14 +461,7 @@
       </w:r>
       <w:r>
         <w:br/>
-      </w:r>
-      <w:proofErr w:type="spellStart"/>
-      <w:r>
-        <w:t>Isolation</w:t>
-      </w:r>
-      <w:proofErr w:type="spellEnd"/>
-      <w:r>
-        <w:t xml:space="preserve"> ensures that multiple transactions running at the same time do not interfere with each other. Each transaction behaves as if it is the only one executing.</w:t>
+        <w:t>Isolation ensures that multiple transactions running at the same time do not interfere with each other. Each transaction behaves as if it is the only one executing.</w:t>
       </w:r>
     </w:p>
     <w:p>
@@ -569,14 +498,7 @@
       </w:r>
       <w:r>
         <w:br/>
-      </w:r>
-      <w:proofErr w:type="spellStart"/>
-      <w:r>
-        <w:t>Durability</w:t>
-      </w:r>
-      <w:proofErr w:type="spellEnd"/>
-      <w:r>
-        <w:t xml:space="preserve"> ensures that once a transaction is successfully committed, the changes are permanently stored in the database, even if the system crashes immediately afterward.</w:t>
+        <w:t>Durability ensures that once a transaction is successfully committed, the changes are permanently stored in the database, even if the system crashes immediately afterward.</w:t>
       </w:r>
     </w:p>
     <w:p>
@@ -639,15 +561,7 @@
     </w:p>
     <w:p>
       <w:r>
-        <w:t xml:space="preserve">ADD COLUMN Email </w:t>
-      </w:r>
-      <w:proofErr w:type="gramStart"/>
-      <w:r>
-        <w:t>VARCHAR(</w:t>
-      </w:r>
-      <w:proofErr w:type="gramEnd"/>
-      <w:r>
-        <w:t>100);</w:t>
+        <w:t>ADD COLUMN Email VARCHAR(100);</w:t>
       </w:r>
     </w:p>
     <w:p/>
@@ -664,15 +578,7 @@
     </w:p>
     <w:p>
       <w:r>
-        <w:t xml:space="preserve">ADD CONSTRAINT </w:t>
-      </w:r>
-      <w:proofErr w:type="spellStart"/>
-      <w:r>
-        <w:t>unique_email</w:t>
-      </w:r>
-      <w:proofErr w:type="spellEnd"/>
-      <w:r>
-        <w:t xml:space="preserve"> UNIQUE (Email);</w:t>
+        <w:t>ADD CONSTRAINT unique_email UNIQUE (Email);</w:t>
       </w:r>
     </w:p>
     <w:p/>
@@ -680,15 +586,7 @@
     <w:p>
       <w:r>
         <w:lastRenderedPageBreak/>
-        <w:t>INSERT INTO Student (</w:t>
-      </w:r>
-      <w:proofErr w:type="spellStart"/>
-      <w:r>
-        <w:t>StudentID</w:t>
-      </w:r>
-      <w:proofErr w:type="spellEnd"/>
-      <w:r>
-        <w:t>, Name, Age, Email)</w:t>
+        <w:t>INSERT INTO Student (StudentID, Name, Age, Email)</w:t>
       </w:r>
     </w:p>
     <w:p>
@@ -709,15 +607,7 @@
     <w:p/>
     <w:p>
       <w:r>
-        <w:t>INSERT INTO Student (</w:t>
-      </w:r>
-      <w:proofErr w:type="spellStart"/>
-      <w:r>
-        <w:t>StudentID</w:t>
-      </w:r>
-      <w:proofErr w:type="spellEnd"/>
-      <w:r>
-        <w:t>, Name, Age, Email)</w:t>
+        <w:t>INSERT INTO Student (StudentID, Name, Age, Email)</w:t>
       </w:r>
     </w:p>
     <w:p>
@@ -727,15 +617,7 @@
     </w:p>
     <w:p>
       <w:r>
-        <w:t>(3, 'Priya', 20, 'vicky@example.com'</w:t>
-      </w:r>
-      <w:proofErr w:type="gramStart"/>
-      <w:r>
-        <w:t>);--</w:t>
-      </w:r>
-      <w:proofErr w:type="gramEnd"/>
-      <w:r>
-        <w:t xml:space="preserve"> duplicate value</w:t>
+        <w:t>(3, 'Priya', 20, 'vicky@example.com');-- duplicate value</w:t>
       </w:r>
     </w:p>
     <w:p/>
@@ -768,23 +650,7 @@
           <w:b/>
           <w:bCs/>
         </w:rPr>
-        <w:t>Add a check constraint to your column (</w:t>
-      </w:r>
-      <w:proofErr w:type="spellStart"/>
-      <w:r>
-        <w:rPr>
-          <w:b/>
-          <w:bCs/>
-        </w:rPr>
-        <w:t>eg</w:t>
-      </w:r>
-      <w:proofErr w:type="spellEnd"/>
-      <w:r>
-        <w:rPr>
-          <w:b/>
-          <w:bCs/>
-        </w:rPr>
-        <w:t>: balance &gt; 0) </w:t>
+        <w:t>Add a check constraint to your column (eg: balance &gt; 0) </w:t>
       </w:r>
     </w:p>
     <w:p>
@@ -794,13 +660,8 @@
     </w:p>
     <w:p>
       <w:r>
-        <w:t xml:space="preserve">ADD CONSTRAINT </w:t>
-      </w:r>
-      <w:proofErr w:type="spellStart"/>
-      <w:r>
-        <w:t>chk_age</w:t>
-      </w:r>
-      <w:proofErr w:type="spellEnd"/>
+        <w:t>ADD CONSTRAINT chk_age</w:t>
+      </w:r>
     </w:p>
     <w:p>
       <w:r>
@@ -809,15 +670,7 @@
     </w:p>
     <w:p>
       <w:r>
-        <w:t>INSERT INTO Student (</w:t>
-      </w:r>
-      <w:proofErr w:type="spellStart"/>
-      <w:r>
-        <w:t>Student_ID</w:t>
-      </w:r>
-      <w:proofErr w:type="spellEnd"/>
-      <w:r>
-        <w:t>, Name, Age, Email)</w:t>
+        <w:t>INSERT INTO Student (Student_ID, Name, Age, Email)</w:t>
       </w:r>
     </w:p>
     <w:p>
@@ -870,15 +723,7 @@
     </w:p>
     <w:p>
       <w:r>
-        <w:t xml:space="preserve">WHERE </w:t>
-      </w:r>
-      <w:proofErr w:type="spellStart"/>
-      <w:r>
-        <w:t>Student_ID</w:t>
-      </w:r>
-      <w:proofErr w:type="spellEnd"/>
-      <w:r>
-        <w:t xml:space="preserve"> = 1;</w:t>
+        <w:t>WHERE Student_ID = 1;</w:t>
       </w:r>
     </w:p>
     <w:p/>
@@ -1043,15 +888,7 @@
     </w:p>
     <w:p>
       <w:r>
-        <w:t xml:space="preserve">ORDER BY </w:t>
-      </w:r>
-      <w:proofErr w:type="spellStart"/>
-      <w:r>
-        <w:t>Student_ID</w:t>
-      </w:r>
-      <w:proofErr w:type="spellEnd"/>
-      <w:r>
-        <w:t xml:space="preserve"> DESC</w:t>
+        <w:t>ORDER BY Student_ID DESC</w:t>
       </w:r>
     </w:p>
     <w:p>
@@ -1073,15 +910,7 @@
     <w:p>
       <w:r>
         <w:lastRenderedPageBreak/>
-        <w:t xml:space="preserve">ORDER BY </w:t>
-      </w:r>
-      <w:proofErr w:type="spellStart"/>
-      <w:r>
-        <w:t>Student_ID</w:t>
-      </w:r>
-      <w:proofErr w:type="spellEnd"/>
-      <w:r>
-        <w:t xml:space="preserve"> DESC</w:t>
+        <w:t>ORDER BY Student_ID DESC</w:t>
       </w:r>
     </w:p>
     <w:p>
@@ -1196,27 +1025,7 @@
     </w:p>
     <w:p>
       <w:r>
-        <w:t xml:space="preserve">left join course c ON </w:t>
-      </w:r>
-      <w:proofErr w:type="spellStart"/>
-      <w:proofErr w:type="gramStart"/>
-      <w:r>
-        <w:t>s.studentId</w:t>
-      </w:r>
-      <w:proofErr w:type="spellEnd"/>
-      <w:proofErr w:type="gramEnd"/>
-      <w:r>
-        <w:t xml:space="preserve"> = </w:t>
-      </w:r>
-      <w:proofErr w:type="spellStart"/>
-      <w:proofErr w:type="gramStart"/>
-      <w:r>
-        <w:t>c.studentid</w:t>
-      </w:r>
-      <w:proofErr w:type="spellEnd"/>
-      <w:proofErr w:type="gramEnd"/>
-      <w:r>
-        <w:t>;</w:t>
+        <w:t>left join course c ON s.studentId = c.studentid;</w:t>
       </w:r>
     </w:p>
     <w:p/>
@@ -1242,27 +1051,7 @@
     </w:p>
     <w:p>
       <w:r>
-        <w:t xml:space="preserve">right join course c on </w:t>
-      </w:r>
-      <w:proofErr w:type="spellStart"/>
-      <w:proofErr w:type="gramStart"/>
-      <w:r>
-        <w:t>s.studentId</w:t>
-      </w:r>
-      <w:proofErr w:type="spellEnd"/>
-      <w:proofErr w:type="gramEnd"/>
-      <w:r>
-        <w:t xml:space="preserve"> = </w:t>
-      </w:r>
-      <w:proofErr w:type="spellStart"/>
-      <w:proofErr w:type="gramStart"/>
-      <w:r>
-        <w:t>c.studentId</w:t>
-      </w:r>
-      <w:proofErr w:type="spellEnd"/>
-      <w:proofErr w:type="gramEnd"/>
-      <w:r>
-        <w:t>;</w:t>
+        <w:t>right join course c on s.studentId = c.studentId;</w:t>
       </w:r>
     </w:p>
     <w:p/>
@@ -1288,43 +1077,18 @@
     </w:p>
     <w:p>
       <w:r>
-        <w:t xml:space="preserve">    </w:t>
-      </w:r>
-      <w:proofErr w:type="spellStart"/>
-      <w:proofErr w:type="gramStart"/>
-      <w:r>
-        <w:t>s.StudentID</w:t>
-      </w:r>
-      <w:proofErr w:type="spellEnd"/>
-      <w:proofErr w:type="gramEnd"/>
-      <w:r>
-        <w:t>,</w:t>
-      </w:r>
-    </w:p>
-    <w:p>
-      <w:r>
-        <w:t xml:space="preserve">    </w:t>
-      </w:r>
-      <w:proofErr w:type="spellStart"/>
-      <w:proofErr w:type="gramStart"/>
-      <w:r>
-        <w:t>s.Name</w:t>
-      </w:r>
-      <w:proofErr w:type="spellEnd"/>
-      <w:proofErr w:type="gramEnd"/>
-      <w:r>
-        <w:t>,</w:t>
-      </w:r>
-    </w:p>
-    <w:p>
-      <w:r>
-        <w:t xml:space="preserve">    </w:t>
-      </w:r>
-      <w:proofErr w:type="spellStart"/>
-      <w:r>
-        <w:t>c.Course_Name</w:t>
-      </w:r>
-      <w:proofErr w:type="spellEnd"/>
+        <w:t xml:space="preserve">    s.StudentID,</w:t>
+      </w:r>
+    </w:p>
+    <w:p>
+      <w:r>
+        <w:t xml:space="preserve">    s.Name,</w:t>
+      </w:r>
+    </w:p>
+    <w:p>
+      <w:r>
+        <w:t xml:space="preserve">    c.Course_Name</w:t>
+      </w:r>
     </w:p>
     <w:p>
       <w:r>
@@ -1338,27 +1102,7 @@
     </w:p>
     <w:p>
       <w:r>
-        <w:t xml:space="preserve">ON </w:t>
-      </w:r>
-      <w:proofErr w:type="spellStart"/>
-      <w:proofErr w:type="gramStart"/>
-      <w:r>
-        <w:t>s.StudentID</w:t>
-      </w:r>
-      <w:proofErr w:type="spellEnd"/>
-      <w:proofErr w:type="gramEnd"/>
-      <w:r>
-        <w:t xml:space="preserve"> = </w:t>
-      </w:r>
-      <w:proofErr w:type="spellStart"/>
-      <w:proofErr w:type="gramStart"/>
-      <w:r>
-        <w:t>c.StudentID</w:t>
-      </w:r>
-      <w:proofErr w:type="spellEnd"/>
-      <w:proofErr w:type="gramEnd"/>
-      <w:r>
-        <w:t>;</w:t>
+        <w:t>ON s.StudentID = c.StudentID;</w:t>
       </w:r>
     </w:p>
     <w:p/>
@@ -1385,15 +1129,7 @@
     <w:p>
       <w:r>
         <w:lastRenderedPageBreak/>
-        <w:t xml:space="preserve">cross </w:t>
-      </w:r>
-      <w:proofErr w:type="gramStart"/>
-      <w:r>
-        <w:t>join  course</w:t>
-      </w:r>
-      <w:proofErr w:type="gramEnd"/>
-      <w:r>
-        <w:t>;</w:t>
+        <w:t>cross join  course;</w:t>
       </w:r>
     </w:p>
     <w:p>
@@ -1440,23 +1176,7 @@
           <w:b/>
           <w:bCs/>
         </w:rPr>
-        <w:t xml:space="preserve">Try playing with indexes on your </w:t>
-      </w:r>
-      <w:proofErr w:type="gramStart"/>
-      <w:r>
-        <w:rPr>
-          <w:b/>
-          <w:bCs/>
-        </w:rPr>
-        <w:t>table..</w:t>
-      </w:r>
-      <w:proofErr w:type="gramEnd"/>
-      <w:r>
-        <w:rPr>
-          <w:b/>
-          <w:bCs/>
-        </w:rPr>
-        <w:t xml:space="preserve"> And see the performance it should increase the query performance.</w:t>
+        <w:t>Try playing with indexes on your table.. And see the performance it should increase the query performance.</w:t>
       </w:r>
     </w:p>
     <w:p/>
@@ -1472,15 +1192,7 @@
     </w:p>
     <w:p>
       <w:r>
-        <w:t xml:space="preserve">CREATE INDEX </w:t>
-      </w:r>
-      <w:proofErr w:type="spellStart"/>
-      <w:r>
-        <w:t>idx_customer_name</w:t>
-      </w:r>
-      <w:proofErr w:type="spellEnd"/>
-      <w:r>
-        <w:t xml:space="preserve"> ON customers (name);</w:t>
+        <w:t>CREATE INDEX idx_customer_name ON customers (name);</w:t>
       </w:r>
     </w:p>
     <w:p/>
@@ -1491,15 +1203,7 @@
     </w:p>
     <w:p>
       <w:r>
-        <w:t xml:space="preserve">CREATE UNIQUE INDEX </w:t>
-      </w:r>
-      <w:proofErr w:type="spellStart"/>
-      <w:r>
-        <w:t>idx_email_unique</w:t>
-      </w:r>
-      <w:proofErr w:type="spellEnd"/>
-      <w:r>
-        <w:t xml:space="preserve"> ON users (email);</w:t>
+        <w:t>CREATE UNIQUE INDEX idx_email_unique ON users (email);</w:t>
       </w:r>
     </w:p>
     <w:p/>
@@ -1510,15 +1214,7 @@
     </w:p>
     <w:p>
       <w:r>
-        <w:t xml:space="preserve">CREATE INDEX </w:t>
-      </w:r>
-      <w:proofErr w:type="spellStart"/>
-      <w:r>
-        <w:t>idx_unbilled_orders</w:t>
-      </w:r>
-      <w:proofErr w:type="spellEnd"/>
-      <w:r>
-        <w:t xml:space="preserve"> ON orders (status) WHERE status = 'unbilled';</w:t>
+        <w:t>CREATE INDEX idx_unbilled_orders ON orders (status) WHERE status = 'unbilled';</w:t>
       </w:r>
     </w:p>
     <w:p/>
@@ -1529,15 +1225,7 @@
     </w:p>
     <w:p>
       <w:r>
-        <w:t xml:space="preserve">CREATE INDEX </w:t>
-      </w:r>
-      <w:proofErr w:type="spellStart"/>
-      <w:r>
-        <w:t>idx_data_json</w:t>
-      </w:r>
-      <w:proofErr w:type="spellEnd"/>
-      <w:r>
-        <w:t xml:space="preserve"> ON documents USING GIN (data);</w:t>
+        <w:t>CREATE INDEX idx_data_json ON documents USING GIN (data);</w:t>
       </w:r>
     </w:p>
     <w:p/>
@@ -1592,23 +1280,7 @@
           <w:b/>
           <w:bCs/>
         </w:rPr>
-        <w:t xml:space="preserve">What are window functions in </w:t>
-      </w:r>
-      <w:proofErr w:type="spellStart"/>
-      <w:r>
-        <w:rPr>
-          <w:b/>
-          <w:bCs/>
-        </w:rPr>
-        <w:t>Postgresql</w:t>
-      </w:r>
-      <w:proofErr w:type="spellEnd"/>
-      <w:r>
-        <w:rPr>
-          <w:b/>
-          <w:bCs/>
-        </w:rPr>
-        <w:t>?</w:t>
+        <w:t>What are window functions in Postgresql?</w:t>
       </w:r>
     </w:p>
     <w:p>
@@ -1730,15 +1402,7 @@
     </w:p>
     <w:p>
       <w:r>
-        <w:t xml:space="preserve">    </w:t>
-      </w:r>
-      <w:proofErr w:type="gramStart"/>
-      <w:r>
-        <w:t>RANK(</w:t>
-      </w:r>
-      <w:proofErr w:type="gramEnd"/>
-      <w:r>
-        <w:t>) OVER (ORDER BY Age DESC) AS Rank</w:t>
+        <w:t xml:space="preserve">    RANK() OVER (ORDER BY Age DESC) AS Rank</w:t>
       </w:r>
     </w:p>
     <w:p>
@@ -1775,23 +1439,7 @@
           <w:b/>
           <w:bCs/>
         </w:rPr>
-        <w:t xml:space="preserve">What are the types of window functions in </w:t>
-      </w:r>
-      <w:proofErr w:type="spellStart"/>
-      <w:r>
-        <w:rPr>
-          <w:b/>
-          <w:bCs/>
-        </w:rPr>
-        <w:t>postgres</w:t>
-      </w:r>
-      <w:proofErr w:type="spellEnd"/>
-      <w:r>
-        <w:rPr>
-          <w:b/>
-          <w:bCs/>
-        </w:rPr>
-        <w:t>?</w:t>
+        <w:t>What are the types of window functions in postgres?</w:t>
       </w:r>
     </w:p>
     <w:p>
@@ -1822,15 +1470,7 @@
         </w:numPr>
       </w:pPr>
       <w:r>
-        <w:t>ROW_</w:t>
-      </w:r>
-      <w:proofErr w:type="gramStart"/>
-      <w:r>
-        <w:t>NUMBER(</w:t>
-      </w:r>
-      <w:proofErr w:type="gramEnd"/>
-      <w:r>
-        <w:t xml:space="preserve">) </w:t>
+        <w:t xml:space="preserve">ROW_NUMBER() </w:t>
       </w:r>
     </w:p>
     <w:p>
@@ -1840,13 +1480,8 @@
           <w:numId w:val="4"/>
         </w:numPr>
       </w:pPr>
-      <w:proofErr w:type="gramStart"/>
-      <w:r>
-        <w:t>RANK(</w:t>
-      </w:r>
-      <w:proofErr w:type="gramEnd"/>
-      <w:r>
-        <w:t xml:space="preserve">) </w:t>
+      <w:r>
+        <w:t xml:space="preserve">RANK() </w:t>
       </w:r>
     </w:p>
     <w:p>
@@ -1857,15 +1492,7 @@
         </w:numPr>
       </w:pPr>
       <w:r>
-        <w:t>DENSE_</w:t>
-      </w:r>
-      <w:proofErr w:type="gramStart"/>
-      <w:r>
-        <w:t>RANK(</w:t>
-      </w:r>
-      <w:proofErr w:type="gramEnd"/>
-      <w:r>
-        <w:t xml:space="preserve">) </w:t>
+        <w:t xml:space="preserve">DENSE_RANK() </w:t>
       </w:r>
     </w:p>
     <w:p>
@@ -1875,13 +1502,8 @@
           <w:numId w:val="4"/>
         </w:numPr>
       </w:pPr>
-      <w:proofErr w:type="gramStart"/>
-      <w:r>
-        <w:t>NTILE(</w:t>
-      </w:r>
-      <w:proofErr w:type="gramEnd"/>
-      <w:r>
-        <w:t xml:space="preserve">) </w:t>
+      <w:r>
+        <w:t xml:space="preserve">NTILE() </w:t>
       </w:r>
     </w:p>
     <w:p>
@@ -1906,13 +1528,8 @@
           <w:numId w:val="5"/>
         </w:numPr>
       </w:pPr>
-      <w:proofErr w:type="gramStart"/>
-      <w:r>
-        <w:t>SUM(</w:t>
-      </w:r>
-      <w:proofErr w:type="gramEnd"/>
-      <w:r>
-        <w:t xml:space="preserve">) </w:t>
+      <w:r>
+        <w:t xml:space="preserve">SUM() </w:t>
       </w:r>
     </w:p>
     <w:p>
@@ -1922,13 +1539,8 @@
           <w:numId w:val="5"/>
         </w:numPr>
       </w:pPr>
-      <w:proofErr w:type="gramStart"/>
-      <w:r>
-        <w:t>AVG(</w:t>
-      </w:r>
-      <w:proofErr w:type="gramEnd"/>
-      <w:r>
-        <w:t xml:space="preserve">) </w:t>
+      <w:r>
+        <w:t xml:space="preserve">AVG() </w:t>
       </w:r>
     </w:p>
     <w:p>
@@ -1938,13 +1550,8 @@
           <w:numId w:val="5"/>
         </w:numPr>
       </w:pPr>
-      <w:proofErr w:type="gramStart"/>
-      <w:r>
-        <w:t>COUNT(</w:t>
-      </w:r>
-      <w:proofErr w:type="gramEnd"/>
-      <w:r>
-        <w:t xml:space="preserve">) </w:t>
+      <w:r>
+        <w:t xml:space="preserve">COUNT() </w:t>
       </w:r>
     </w:p>
     <w:p>
@@ -1954,14 +1561,9 @@
           <w:numId w:val="5"/>
         </w:numPr>
       </w:pPr>
-      <w:proofErr w:type="gramStart"/>
       <w:r>
         <w:lastRenderedPageBreak/>
-        <w:t>MIN(</w:t>
-      </w:r>
-      <w:proofErr w:type="gramEnd"/>
-      <w:r>
-        <w:t xml:space="preserve">) </w:t>
+        <w:t xml:space="preserve">MIN() </w:t>
       </w:r>
     </w:p>
     <w:p>
@@ -1971,13 +1573,8 @@
           <w:numId w:val="5"/>
         </w:numPr>
       </w:pPr>
-      <w:proofErr w:type="gramStart"/>
-      <w:r>
-        <w:t>MAX(</w:t>
-      </w:r>
-      <w:proofErr w:type="gramEnd"/>
-      <w:r>
-        <w:t xml:space="preserve">) </w:t>
+      <w:r>
+        <w:t xml:space="preserve">MAX() </w:t>
       </w:r>
     </w:p>
     <w:p>
@@ -2002,13 +1599,8 @@
           <w:numId w:val="6"/>
         </w:numPr>
       </w:pPr>
-      <w:proofErr w:type="gramStart"/>
-      <w:r>
-        <w:t>LAG(</w:t>
-      </w:r>
-      <w:proofErr w:type="gramEnd"/>
-      <w:r>
-        <w:t xml:space="preserve">) </w:t>
+      <w:r>
+        <w:t xml:space="preserve">LAG() </w:t>
       </w:r>
     </w:p>
     <w:p>
@@ -2018,13 +1610,8 @@
           <w:numId w:val="6"/>
         </w:numPr>
       </w:pPr>
-      <w:proofErr w:type="gramStart"/>
-      <w:r>
-        <w:t>LEAD(</w:t>
-      </w:r>
-      <w:proofErr w:type="gramEnd"/>
-      <w:r>
-        <w:t xml:space="preserve">) </w:t>
+      <w:r>
+        <w:t xml:space="preserve">LEAD() </w:t>
       </w:r>
     </w:p>
     <w:p>
@@ -2035,15 +1622,7 @@
         </w:numPr>
       </w:pPr>
       <w:r>
-        <w:t>FIRST_</w:t>
-      </w:r>
-      <w:proofErr w:type="gramStart"/>
-      <w:r>
-        <w:t>VALUE(</w:t>
-      </w:r>
-      <w:proofErr w:type="gramEnd"/>
-      <w:r>
-        <w:t xml:space="preserve">) </w:t>
+        <w:t xml:space="preserve">FIRST_VALUE() </w:t>
       </w:r>
     </w:p>
     <w:p>
@@ -2054,15 +1633,7 @@
         </w:numPr>
       </w:pPr>
       <w:r>
-        <w:t>LAST_</w:t>
-      </w:r>
-      <w:proofErr w:type="gramStart"/>
-      <w:r>
-        <w:t>VALUE(</w:t>
-      </w:r>
-      <w:proofErr w:type="gramEnd"/>
-      <w:r>
-        <w:t xml:space="preserve">) </w:t>
+        <w:t xml:space="preserve">LAST_VALUE() </w:t>
       </w:r>
     </w:p>
     <w:p>
@@ -2073,15 +1644,7 @@
         </w:numPr>
       </w:pPr>
       <w:r>
-        <w:t>NTH_</w:t>
-      </w:r>
-      <w:proofErr w:type="gramStart"/>
-      <w:r>
-        <w:t>VALUE(</w:t>
-      </w:r>
-      <w:proofErr w:type="gramEnd"/>
-      <w:r>
-        <w:t xml:space="preserve">) </w:t>
+        <w:t xml:space="preserve">NTH_VALUE() </w:t>
       </w:r>
     </w:p>
     <w:p/>
@@ -2120,21 +1683,12 @@
       <w:r>
         <w:t xml:space="preserve"> Every window function must use the </w:t>
       </w:r>
-      <w:proofErr w:type="gramStart"/>
-      <w:r>
-        <w:rPr>
-          <w:b/>
-          <w:bCs/>
-        </w:rPr>
-        <w:t>OVER(</w:t>
-      </w:r>
-      <w:proofErr w:type="gramEnd"/>
-      <w:r>
-        <w:rPr>
-          <w:b/>
-          <w:bCs/>
-        </w:rPr>
-        <w:t>)</w:t>
+      <w:r>
+        <w:rPr>
+          <w:b/>
+          <w:bCs/>
+        </w:rPr>
+        <w:t>OVER()</w:t>
       </w:r>
       <w:r>
         <w:t xml:space="preserve"> clause. </w:t>
@@ -2213,32 +1767,7 @@
           <w:b/>
           <w:bCs/>
         </w:rPr>
-        <w:t xml:space="preserve">Do we have JSON/JSONB data types in </w:t>
-      </w:r>
-      <w:proofErr w:type="spellStart"/>
-      <w:proofErr w:type="gramStart"/>
-      <w:r>
-        <w:rPr>
-          <w:b/>
-          <w:bCs/>
-        </w:rPr>
-        <w:t>postgresql</w:t>
-      </w:r>
-      <w:proofErr w:type="spellEnd"/>
-      <w:r>
-        <w:rPr>
-          <w:b/>
-          <w:bCs/>
-        </w:rPr>
-        <w:t xml:space="preserve"> ?</w:t>
-      </w:r>
-      <w:proofErr w:type="gramEnd"/>
-      <w:r>
-        <w:rPr>
-          <w:b/>
-          <w:bCs/>
-        </w:rPr>
-        <w:t xml:space="preserve"> What is the diff between them?</w:t>
+        <w:t>Do we have JSON/JSONB data types in postgresql ? What is the diff between them?</w:t>
       </w:r>
     </w:p>
     <w:p>
@@ -2403,23 +1932,7 @@
           <w:b/>
           <w:bCs/>
         </w:rPr>
-        <w:t xml:space="preserve">What is full text search in </w:t>
-      </w:r>
-      <w:proofErr w:type="spellStart"/>
-      <w:r>
-        <w:rPr>
-          <w:b/>
-          <w:bCs/>
-        </w:rPr>
-        <w:t>postgresql</w:t>
-      </w:r>
-      <w:proofErr w:type="spellEnd"/>
-      <w:r>
-        <w:rPr>
-          <w:b/>
-          <w:bCs/>
-        </w:rPr>
-        <w:t>? Explain briefly?</w:t>
+        <w:t>What is full text search in postgresql? Explain briefly?</w:t>
       </w:r>
     </w:p>
     <w:p>
@@ -2511,76 +2024,12 @@
           <w:b/>
           <w:bCs/>
         </w:rPr>
-        <w:t xml:space="preserve">What do you understand by full text search in </w:t>
-      </w:r>
-      <w:proofErr w:type="spellStart"/>
-      <w:r>
-        <w:rPr>
-          <w:b/>
-          <w:bCs/>
-        </w:rPr>
-        <w:t>postgresql</w:t>
-      </w:r>
-      <w:proofErr w:type="spellEnd"/>
-      <w:r>
-        <w:rPr>
-          <w:b/>
-          <w:bCs/>
-        </w:rPr>
-        <w:t>?</w:t>
-      </w:r>
-    </w:p>
-    <w:p>
-      <w:r>
-        <w:t xml:space="preserve">Full Text Search converts text into searchable tokens using </w:t>
-      </w:r>
-      <w:proofErr w:type="spellStart"/>
-      <w:r>
-        <w:t>to_</w:t>
-      </w:r>
-      <w:proofErr w:type="gramStart"/>
-      <w:r>
-        <w:t>tsvector</w:t>
-      </w:r>
-      <w:proofErr w:type="spellEnd"/>
-      <w:r>
-        <w:t>(</w:t>
-      </w:r>
-      <w:proofErr w:type="gramEnd"/>
-      <w:r>
-        <w:t xml:space="preserve">) and compares them with search terms created using </w:t>
-      </w:r>
-      <w:proofErr w:type="spellStart"/>
-      <w:r>
-        <w:t>to_</w:t>
-      </w:r>
-      <w:proofErr w:type="gramStart"/>
-      <w:r>
-        <w:t>tsquery</w:t>
-      </w:r>
-      <w:proofErr w:type="spellEnd"/>
-      <w:r>
-        <w:t>(</w:t>
-      </w:r>
-      <w:proofErr w:type="gramEnd"/>
-      <w:r>
-        <w:t xml:space="preserve">) or </w:t>
-      </w:r>
-      <w:proofErr w:type="spellStart"/>
-      <w:r>
-        <w:t>plainto_</w:t>
-      </w:r>
-      <w:proofErr w:type="gramStart"/>
-      <w:r>
-        <w:t>tsquery</w:t>
-      </w:r>
-      <w:proofErr w:type="spellEnd"/>
-      <w:r>
-        <w:t>(</w:t>
-      </w:r>
-      <w:proofErr w:type="gramEnd"/>
-      <w:r>
-        <w:t>).</w:t>
+        <w:t>What do you understand by full text search in postgresql?</w:t>
+      </w:r>
+    </w:p>
+    <w:p>
+      <w:r>
+        <w:t>Full Text Search converts text into searchable tokens using to_tsvector() and compares them with search terms created using to_tsquery() or plainto_tsquery().</w:t>
       </w:r>
     </w:p>
     <w:p>
@@ -2668,39 +2117,7 @@
           <w:b/>
           <w:bCs/>
         </w:rPr>
-        <w:t xml:space="preserve">What does </w:t>
-      </w:r>
-      <w:proofErr w:type="spellStart"/>
-      <w:r>
-        <w:rPr>
-          <w:b/>
-          <w:bCs/>
-        </w:rPr>
-        <w:t>savepoint</w:t>
-      </w:r>
-      <w:proofErr w:type="spellEnd"/>
-      <w:r>
-        <w:rPr>
-          <w:b/>
-          <w:bCs/>
-        </w:rPr>
-        <w:t xml:space="preserve"> do in </w:t>
-      </w:r>
-      <w:proofErr w:type="spellStart"/>
-      <w:r>
-        <w:rPr>
-          <w:b/>
-          <w:bCs/>
-        </w:rPr>
-        <w:t>postgres</w:t>
-      </w:r>
-      <w:proofErr w:type="spellEnd"/>
-      <w:r>
-        <w:rPr>
-          <w:b/>
-          <w:bCs/>
-        </w:rPr>
-        <w:t>?</w:t>
+        <w:t>What does savepoint do in postgres?</w:t>
       </w:r>
     </w:p>
     <w:p>
@@ -2754,7 +2171,6 @@
         <w:t>ROLLBACK TO SAVEPOINT sp1;</w:t>
       </w:r>
     </w:p>
-    <w:p/>
     <w:p>
       <w:r>
         <w:t>COMMIT;</w:t>

</xml_diff>